<commit_message>
Drop the Protocol Flamingo scratch scripts and keep the latest quantum draft.
Co-authored-by: Cursor <cursoragent@cursor.com>
</commit_message>
<xml_diff>
--- a/Science Books/The Quantum Conversation/manuscript_draft.docx
+++ b/Science Books/The Quantum Conversation/manuscript_draft.docx
@@ -30511,7 +30511,7 @@
         </w:rPr>
         <w:t xml:space="preserve"> 115, 485, 1959), </w:t>
       </w:r>
-      <w:hyperlink w:history="1" r:id="rId1k0ynlmto2qcdgcmyyuvl">
+      <w:hyperlink w:history="1" r:id="rIdsrlc0xqrceapjxdvfevwv">
         <w:r>
           <w:rPr>
             <w:rFonts w:ascii="Cambria" w:cs="Cambria" w:eastAsia="Cambria" w:hAnsi="Cambria"/>
@@ -30555,7 +30555,7 @@
         </w:rPr>
         <w:t xml:space="preserve"> 56, 792, 1986), </w:t>
       </w:r>
-      <w:hyperlink w:history="1" r:id="rId8on5wwuqnqve-mv-c7yqb">
+      <w:hyperlink w:history="1" r:id="rIdp_ne0sggej9ubl_i18zde">
         <w:r>
           <w:rPr>
             <w:rFonts w:ascii="Cambria" w:cs="Cambria" w:eastAsia="Cambria" w:hAnsi="Cambria"/>
@@ -30699,7 +30699,7 @@
         </w:rPr>
         <w:t xml:space="preserve">, 1905), </w:t>
       </w:r>
-      <w:hyperlink w:history="1" r:id="rIdets8rxmhliko3n1hfa4te">
+      <w:hyperlink w:history="1" r:id="rIdd3t5ccpdcijdkw1oicfuu">
         <w:r>
           <w:rPr>
             <w:rFonts w:ascii="Cambria" w:cs="Cambria" w:eastAsia="Cambria" w:hAnsi="Cambria"/>
@@ -30771,7 +30771,7 @@
         </w:rPr>
         <w:t xml:space="preserve"> 20, 367, 1948), </w:t>
       </w:r>
-      <w:hyperlink w:history="1" r:id="rIdr4jqxlibwroylfuyhqr2m">
+      <w:hyperlink w:history="1" r:id="rIdiexzrrf_pfae3bsdxal84">
         <w:r>
           <w:rPr>
             <w:rFonts w:ascii="Cambria" w:cs="Cambria" w:eastAsia="Cambria" w:hAnsi="Cambria"/>
@@ -30833,7 +30833,7 @@
         </w:rPr>
         <w:t xml:space="preserve"> 17, 157, 1945), </w:t>
       </w:r>
-      <w:hyperlink w:history="1" r:id="rIdgn_-mfca-80d6-twreeiw">
+      <w:hyperlink w:history="1" r:id="rId-ey9johh-w6wcclh-0zmu">
         <w:r>
           <w:rPr>
             <w:rFonts w:ascii="Cambria" w:cs="Cambria" w:eastAsia="Cambria" w:hAnsi="Cambria"/>
@@ -30877,7 +30877,7 @@
         </w:rPr>
         <w:t xml:space="preserve"> 21, 425, 1949), </w:t>
       </w:r>
-      <w:hyperlink w:history="1" r:id="rIdpz--sijpmzrzjb3tnf0n6">
+      <w:hyperlink w:history="1" r:id="rIdqdfu383ibvyjnvkcbbvf7">
         <w:r>
           <w:rPr>
             <w:rFonts w:ascii="Cambria" w:cs="Cambria" w:eastAsia="Cambria" w:hAnsi="Cambria"/>
@@ -30939,7 +30939,7 @@
         </w:rPr>
         <w:t xml:space="preserve"> 72, 241, 1947), </w:t>
       </w:r>
-      <w:hyperlink w:history="1" r:id="rIditnmwe5wm8uf5yqnc7_yg">
+      <w:hyperlink w:history="1" r:id="rIdlmnyfrc5dqegm2ehouyxf">
         <w:r>
           <w:rPr>
             <w:rFonts w:ascii="Cambria" w:cs="Cambria" w:eastAsia="Cambria" w:hAnsi="Cambria"/>
@@ -31031,7 +31031,7 @@
         </w:rPr>
         <w:t xml:space="preserve"> 1, 186 (1971), </w:t>
       </w:r>
-      <w:hyperlink w:history="1" r:id="rIdqrc4lg6lyfsryiceeolpx">
+      <w:hyperlink w:history="1" r:id="rIdqvofqm_dkt2kvad2iybxc">
         <w:r>
           <w:rPr>
             <w:rFonts w:ascii="Cambria" w:cs="Cambria" w:eastAsia="Cambria" w:hAnsi="Cambria"/>
@@ -31093,7 +31093,7 @@
         </w:rPr>
         <w:t xml:space="preserve"> B51, 793, 1948). The academy’s scan of that paper is at </w:t>
       </w:r>
-      <w:hyperlink w:history="1" r:id="rIdn55q5typuqiu1zygvyeoi">
+      <w:hyperlink w:history="1" r:id="rIdiooltwew1akbedv2fhy2u">
         <w:r>
           <w:rPr>
             <w:rFonts w:ascii="Cambria" w:cs="Cambria" w:eastAsia="Cambria" w:hAnsi="Cambria"/>
@@ -31137,7 +31137,7 @@
         </w:rPr>
         <w:t xml:space="preserve"> 78, 5, 1997), </w:t>
       </w:r>
-      <w:hyperlink w:history="1" r:id="rIdwdnmiyryzji9qoquvdy23">
+      <w:hyperlink w:history="1" r:id="rIdkjiyfdeddp6o25807uvqo">
         <w:r>
           <w:rPr>
             <w:rFonts w:ascii="Cambria" w:cs="Cambria" w:eastAsia="Cambria" w:hAnsi="Cambria"/>
@@ -31199,7 +31199,7 @@
         </w:rPr>
         <w:t xml:space="preserve"> 5, 1174, 1957). The journal’s English PDF is at </w:t>
       </w:r>
-      <w:hyperlink w:history="1" r:id="rIdrehe2mxcptsfnekq3tqdi">
+      <w:hyperlink w:history="1" r:id="rIdbi43m7tljyqnrfkbhvsg1">
         <w:r>
           <w:rPr>
             <w:rFonts w:ascii="Cambria" w:cs="Cambria" w:eastAsia="Cambria" w:hAnsi="Cambria"/>
@@ -31271,7 +31271,7 @@
         </w:rPr>
         <w:t xml:space="preserve"> 133, 60, 1931), </w:t>
       </w:r>
-      <w:hyperlink w:history="1" r:id="rId4zsdtpsp3imdiung8khkd">
+      <w:hyperlink w:history="1" r:id="rId21liubrtiy-v-qawebq6p">
         <w:r>
           <w:rPr>
             <w:rFonts w:ascii="Cambria" w:cs="Cambria" w:eastAsia="Cambria" w:hAnsi="Cambria"/>
@@ -31377,7 +31377,7 @@
         </w:rPr>
         <w:t xml:space="preserve"> 1, 173, 1986), </w:t>
       </w:r>
-      <w:hyperlink w:history="1" r:id="rId4jtyde1kz3knnmaagtkoz">
+      <w:hyperlink w:history="1" r:id="rId_pl-p1yiai2_clzhpptei">
         <w:r>
           <w:rPr>
             <w:rFonts w:ascii="Cambria" w:cs="Cambria" w:eastAsia="Cambria" w:hAnsi="Cambria"/>
@@ -31459,7 +31459,7 @@
         </w:rPr>
         <w:t xml:space="preserve"> 73, 416, 1948), </w:t>
       </w:r>
-      <w:hyperlink w:history="1" r:id="rIddi1hat9uauk4kj5sce93a">
+      <w:hyperlink w:history="1" r:id="rIdagq57c4qpffkwjoyfh6gf">
         <w:r>
           <w:rPr>
             <w:rFonts w:ascii="Cambria" w:cs="Cambria" w:eastAsia="Cambria" w:hAnsi="Cambria"/>
@@ -31503,7 +31503,7 @@
         </w:rPr>
         <w:t xml:space="preserve"> 130, 071801, 2023), </w:t>
       </w:r>
-      <w:hyperlink w:history="1" r:id="rIdwp56oywbxb1lxwo8todui">
+      <w:hyperlink w:history="1" r:id="rIdtn_emm4ghtjdvnch-zbmz">
         <w:r>
           <w:rPr>
             <w:rFonts w:ascii="Cambria" w:cs="Cambria" w:eastAsia="Cambria" w:hAnsi="Cambria"/>
@@ -31642,7 +31642,7 @@
         </w:rPr>
         <w:t xml:space="preserve"> 1, 251, 1962), </w:t>
       </w:r>
-      <w:hyperlink w:history="1" r:id="rIdpngoew44zqtcdnfjvienv">
+      <w:hyperlink w:history="1" r:id="rId6tocrs3frwzcavy-mh0wk">
         <w:r>
           <w:rPr>
             <w:rFonts w:ascii="Cambria" w:cs="Cambria" w:eastAsia="Cambria" w:hAnsi="Cambria"/>
@@ -31965,7 +31965,7 @@
         </w:rPr>
         <w:t xml:space="preserve"> 93, 025005, 2021), </w:t>
       </w:r>
-      <w:hyperlink w:history="1" r:id="rIdvqzm0kujnogfj6o89nxvm">
+      <w:hyperlink w:history="1" r:id="rIdmhcd2aaj7dpvqh-ty7_ij">
         <w:r>
           <w:rPr>
             <w:rFonts w:ascii="Cambria" w:cs="Cambria" w:eastAsia="Cambria" w:hAnsi="Cambria"/>

</xml_diff>

<commit_message>
Quantum Conversation + Quantum World: audit fixes, series front/back matter, KDP descriptions, QC chapter renumbering, docx rebuilt
</commit_message>
<xml_diff>
--- a/Science Books/The Quantum Conversation/manuscript_draft.docx
+++ b/Science Books/The Quantum Conversation/manuscript_draft.docx
@@ -66,6 +66,22 @@
           <w:szCs w:val="24"/>
         </w:rPr>
         <w:t xml:space="preserve">An interaction, looked at closely enough, is a conversation.</w:t>
+      </w:r>
+    </w:p>
+    <w:p>
+      <w:pPr>
+        <w:spacing w:after="260" w:line="360" w:lineRule="auto"/>
+        <w:jc w:val="center"/>
+      </w:pPr>
+      <w:r>
+        <w:rPr>
+          <w:rFonts w:ascii="Cambria Math" w:cs="Cambria Math" w:eastAsia="Cambria Math" w:hAnsi="Cambria Math"/>
+          <w:i/>
+          <w:iCs/>
+          <w:sz w:val="24"/>
+          <w:szCs w:val="24"/>
+        </w:rPr>
+        <w:t xml:space="preserve">Copyright © 2026 Lothar J. Musiol. All rights reserved. First edition, 2026.</w:t>
       </w:r>
     </w:p>
     <w:p>
@@ -1016,7 +1032,7 @@
             <w:szCs w:val="22"/>
             <w:u w:val="single"/>
           </w:rPr>
-          <w:t xml:space="preserve">18. Radiation Is Where Things Get Serious</w:t>
+          <w:t xml:space="preserve">17. Radiation Is Where Things Get Serious</w:t>
         </w:r>
       </w:hyperlink>
       <w:r>
@@ -1056,7 +1072,7 @@
             <w:szCs w:val="22"/>
             <w:u w:val="single"/>
           </w:rPr>
-          <w:t xml:space="preserve">19. Where Is the Energy?</w:t>
+          <w:t xml:space="preserve">18. Where Is the Energy?</w:t>
         </w:r>
       </w:hyperlink>
       <w:r>
@@ -1135,7 +1151,7 @@
             <w:szCs w:val="22"/>
             <w:u w:val="single"/>
           </w:rPr>
-          <w:t xml:space="preserve">20. What QED Adds</w:t>
+          <w:t xml:space="preserve">19. What QED Adds</w:t>
         </w:r>
       </w:hyperlink>
       <w:r>
@@ -1175,7 +1191,7 @@
             <w:szCs w:val="22"/>
             <w:u w:val="single"/>
           </w:rPr>
-          <w:t xml:space="preserve">21. The Geometry of the Potential</w:t>
+          <w:t xml:space="preserve">20. The Geometry of the Potential</w:t>
         </w:r>
       </w:hyperlink>
       <w:r>
@@ -1215,7 +1231,7 @@
             <w:szCs w:val="22"/>
             <w:u w:val="single"/>
           </w:rPr>
-          <w:t xml:space="preserve">22. The Art of Forgetting</w:t>
+          <w:t xml:space="preserve">21. The Art of Forgetting</w:t>
         </w:r>
       </w:hyperlink>
       <w:r>
@@ -1255,7 +1271,7 @@
             <w:szCs w:val="22"/>
             <w:u w:val="single"/>
           </w:rPr>
-          <w:t xml:space="preserve">23. The Meaning of “Fundamental”</w:t>
+          <w:t xml:space="preserve">22. The Meaning of “Fundamental”</w:t>
         </w:r>
       </w:hyperlink>
       <w:r>
@@ -1334,7 +1350,7 @@
             <w:szCs w:val="22"/>
             <w:u w:val="single"/>
           </w:rPr>
-          <w:t xml:space="preserve">24. Charge Is the Price of Changing Phase Locally</w:t>
+          <w:t xml:space="preserve">23. Charge Is the Price of Changing Phase Locally</w:t>
         </w:r>
       </w:hyperlink>
       <w:r>
@@ -1374,7 +1390,7 @@
             <w:szCs w:val="22"/>
             <w:u w:val="single"/>
           </w:rPr>
-          <w:t xml:space="preserve">25. Why the Classical Path Wins</w:t>
+          <w:t xml:space="preserve">24. Why the Classical Path Wins</w:t>
         </w:r>
       </w:hyperlink>
       <w:r>
@@ -1414,7 +1430,7 @@
             <w:szCs w:val="22"/>
             <w:u w:val="single"/>
           </w:rPr>
-          <w:t xml:space="preserve">26. Magnetism, Light, and Empty Space</w:t>
+          <w:t xml:space="preserve">25. Magnetism, Light, and Empty Space</w:t>
         </w:r>
       </w:hyperlink>
       <w:r>
@@ -1454,7 +1470,7 @@
             <w:szCs w:val="22"/>
             <w:u w:val="single"/>
           </w:rPr>
-          <w:t xml:space="preserve">27. The Phase Can Wind</w:t>
+          <w:t xml:space="preserve">26. The Phase Can Wind</w:t>
         </w:r>
       </w:hyperlink>
       <w:r>
@@ -1533,7 +1549,7 @@
             <w:szCs w:val="22"/>
             <w:u w:val="single"/>
           </w:rPr>
-          <w:t xml:space="preserve">28. The Equation Behind the Conversation</w:t>
+          <w:t xml:space="preserve">27. The Equation Behind the Conversation</w:t>
         </w:r>
       </w:hyperlink>
       <w:r>
@@ -1573,7 +1589,7 @@
             <w:szCs w:val="22"/>
             <w:u w:val="single"/>
           </w:rPr>
-          <w:t xml:space="preserve">29. Feynman’s Diagrams Become Less Mysterious</w:t>
+          <w:t xml:space="preserve">28. Feynman’s Diagrams Become Less Mysterious</w:t>
         </w:r>
       </w:hyperlink>
       <w:r>
@@ -1613,7 +1629,7 @@
             <w:szCs w:val="22"/>
             <w:u w:val="single"/>
           </w:rPr>
-          <w:t xml:space="preserve">30. The Classical Coulomb Force Emerges</w:t>
+          <w:t xml:space="preserve">29. The Classical Coulomb Force Emerges</w:t>
         </w:r>
       </w:hyperlink>
       <w:r>
@@ -1653,7 +1669,7 @@
             <w:szCs w:val="22"/>
             <w:u w:val="single"/>
           </w:rPr>
-          <w:t xml:space="preserve">31. Now Add Many Electrons</w:t>
+          <w:t xml:space="preserve">30. Now Add Many Electrons</w:t>
         </w:r>
       </w:hyperlink>
       <w:r>
@@ -1693,7 +1709,7 @@
             <w:szCs w:val="22"/>
             <w:u w:val="single"/>
           </w:rPr>
-          <w:t xml:space="preserve">32. The Book’s Central Bridge</w:t>
+          <w:t xml:space="preserve">31. The Book’s Central Bridge</w:t>
         </w:r>
       </w:hyperlink>
       <w:r>
@@ -1772,7 +1788,7 @@
             <w:szCs w:val="22"/>
             <w:u w:val="single"/>
           </w:rPr>
-          <w:t xml:space="preserve">33. The Photon Is Not the Opposite of the Phase</w:t>
+          <w:t xml:space="preserve">32. The Photon Is Not the Opposite of the Phase</w:t>
         </w:r>
       </w:hyperlink>
       <w:r>
@@ -1812,7 +1828,7 @@
             <w:szCs w:val="22"/>
             <w:u w:val="single"/>
           </w:rPr>
-          <w:t xml:space="preserve">34. When Matter Meets Light</w:t>
+          <w:t xml:space="preserve">33. When Matter Meets Light</w:t>
         </w:r>
       </w:hyperlink>
       <w:r>
@@ -1852,7 +1868,7 @@
             <w:szCs w:val="22"/>
             <w:u w:val="single"/>
           </w:rPr>
-          <w:t xml:space="preserve">35. The Loop, Formalized</w:t>
+          <w:t xml:space="preserve">34. The Loop, Formalized</w:t>
         </w:r>
       </w:hyperlink>
       <w:r>
@@ -1931,7 +1947,7 @@
             <w:szCs w:val="22"/>
             <w:u w:val="single"/>
           </w:rPr>
-          <w:t xml:space="preserve">36. Vacuum Polarization: The Electron Is Not Quite Alone</w:t>
+          <w:t xml:space="preserve">35. Vacuum Polarization: The Electron Is Not Quite Alone</w:t>
         </w:r>
       </w:hyperlink>
       <w:r>
@@ -1971,7 +1987,7 @@
             <w:szCs w:val="22"/>
             <w:u w:val="single"/>
           </w:rPr>
-          <w:t xml:space="preserve">37. The Terrible Reputation of Renormalization</w:t>
+          <w:t xml:space="preserve">36. The Terrible Reputation of Renormalization</w:t>
         </w:r>
       </w:hyperlink>
       <w:r>
@@ -2011,7 +2027,7 @@
             <w:szCs w:val="22"/>
             <w:u w:val="single"/>
           </w:rPr>
-          <w:t xml:space="preserve">38. A Resolution Dial</w:t>
+          <w:t xml:space="preserve">37. A Resolution Dial</w:t>
         </w:r>
       </w:hyperlink>
       <w:r>
@@ -2051,7 +2067,7 @@
             <w:szCs w:val="22"/>
             <w:u w:val="single"/>
           </w:rPr>
-          <w:t xml:space="preserve">39. Renormalization Is a Translation System</w:t>
+          <w:t xml:space="preserve">38. Renormalization Is a Translation System</w:t>
         </w:r>
       </w:hyperlink>
       <w:r>
@@ -2130,7 +2146,7 @@
             <w:szCs w:val="22"/>
             <w:u w:val="single"/>
           </w:rPr>
-          <w:t xml:space="preserve">40. From QED to a Superconducting Circuit</w:t>
+          <w:t xml:space="preserve">39. From QED to a Superconducting Circuit</w:t>
         </w:r>
       </w:hyperlink>
       <w:r>
@@ -2170,7 +2186,7 @@
             <w:szCs w:val="22"/>
             <w:u w:val="single"/>
           </w:rPr>
-          <w:t xml:space="preserve">41. One System, Several Descriptions</w:t>
+          <w:t xml:space="preserve">40. One System, Several Descriptions</w:t>
         </w:r>
       </w:hyperlink>
       <w:r>
@@ -2210,7 +2226,7 @@
             <w:szCs w:val="22"/>
             <w:u w:val="single"/>
           </w:rPr>
-          <w:t xml:space="preserve">42. The Same Wire Contains All Four Worlds</w:t>
+          <w:t xml:space="preserve">41. The Same Wire Contains All Four Worlds</w:t>
         </w:r>
       </w:hyperlink>
       <w:r>
@@ -2289,7 +2305,7 @@
             <w:szCs w:val="22"/>
             <w:u w:val="single"/>
           </w:rPr>
-          <w:t xml:space="preserve">43. A Tiny Charge With a Huge Story</w:t>
+          <w:t xml:space="preserve">42. A Tiny Charge With a Huge Story</w:t>
         </w:r>
       </w:hyperlink>
       <w:r>
@@ -2329,7 +2345,7 @@
             <w:szCs w:val="22"/>
             <w:u w:val="single"/>
           </w:rPr>
-          <w:t xml:space="preserve">44. The Electron in a Superconductor</w:t>
+          <w:t xml:space="preserve">43. The Electron in a Superconductor</w:t>
         </w:r>
       </w:hyperlink>
       <w:r>
@@ -2369,7 +2385,7 @@
             <w:szCs w:val="22"/>
             <w:u w:val="single"/>
           </w:rPr>
-          <w:t xml:space="preserve">45. Is the Field Real?</w:t>
+          <w:t xml:space="preserve">44. Is the Field Real?</w:t>
         </w:r>
       </w:hyperlink>
       <w:r>
@@ -2448,7 +2464,7 @@
             <w:szCs w:val="22"/>
             <w:u w:val="single"/>
           </w:rPr>
-          <w:t xml:space="preserve">46. The Ladder of Descriptions: Electron to Eye</w:t>
+          <w:t xml:space="preserve">45. The Ladder of Descriptions: Electron to Eye</w:t>
         </w:r>
       </w:hyperlink>
       <w:r>
@@ -2488,7 +2504,7 @@
             <w:szCs w:val="22"/>
             <w:u w:val="single"/>
           </w:rPr>
-          <w:t xml:space="preserve">47. What We Have Learned, and What We Have Not Proven</w:t>
+          <w:t xml:space="preserve">46. What We Have Learned, and What We Have Not Proven</w:t>
         </w:r>
       </w:hyperlink>
       <w:r>
@@ -2528,7 +2544,7 @@
             <w:szCs w:val="22"/>
             <w:u w:val="single"/>
           </w:rPr>
-          <w:t xml:space="preserve">48. Epilogue: The Law Becomes Visible</w:t>
+          <w:t xml:space="preserve">47. Epilogue: The Law Becomes Visible</w:t>
         </w:r>
       </w:hyperlink>
       <w:r>
@@ -3356,7 +3372,27 @@
           <w:sz w:val="24"/>
           <w:szCs w:val="24"/>
         </w:rPr>
-        <w:t xml:space="preserve">, elsewhere in this series, will recognize the seed: an interlude on collective electrodynamics, after the chapters on QED, cryptography, and computing, that asked for a book of its own.</w:t>
+        <w:t xml:space="preserve">, the companion book to the </w:t>
+      </w:r>
+      <w:r>
+        <w:rPr>
+          <w:rFonts w:ascii="Cambria Math" w:cs="Cambria Math" w:eastAsia="Cambria Math" w:hAnsi="Cambria Math"/>
+          <w:i/>
+          <w:iCs/>
+          <w:sz w:val="24"/>
+          <w:szCs w:val="24"/>
+        </w:rPr>
+        <w:t xml:space="preserve">Physics, Actually</w:t>
+      </w:r>
+      <w:r>
+        <w:rPr>
+          <w:rFonts w:ascii="Cambria" w:cs="Cambria" w:eastAsia="Cambria" w:hAnsi="Cambria"/>
+          <w:i w:val="false"/>
+          <w:iCs w:val="false"/>
+          <w:sz w:val="24"/>
+          <w:szCs w:val="24"/>
+        </w:rPr>
+        <w:t xml:space="preserve"> series, will recognize the seed: an appendix on collective electrodynamics, placed after the chapters on QED, cryptography, and computing, that asked for a book of its own.</w:t>
       </w:r>
     </w:p>
     <w:p>
@@ -3534,7 +3570,7 @@
           <w:sz w:val="24"/>
           <w:szCs w:val="24"/>
         </w:rPr>
-        <w:t xml:space="preserve"> through 8, then 28 and 32, then 40 through 42, then 47. The parts between those chapters are where the fields return, where the absorber question is kept in its place, and where QED’s precision is earned, so that route is a tour of the spine.</w:t>
+        <w:t xml:space="preserve"> through 8, then 27 and 31, then 39 through 41, then 46. The parts between those chapters are where the fields return, where the absorber question is kept in its place, and where QED’s precision is earned, so that route is a tour of the spine.</w:t>
       </w:r>
     </w:p>
     <w:p>
@@ -3893,7 +3929,7 @@
             <w:szCs w:val="24"/>
             <w:u w:val="single"/>
           </w:rPr>
-          <w:t xml:space="preserve">25</w:t>
+          <w:t xml:space="preserve">24</w:t>
         </w:r>
       </w:hyperlink>
       <w:r>
@@ -4520,7 +4556,7 @@
             <w:szCs w:val="24"/>
             <w:u w:val="single"/>
           </w:rPr>
-          <w:t xml:space="preserve">30</w:t>
+          <w:t xml:space="preserve">29</w:t>
         </w:r>
       </w:hyperlink>
       <w:r>
@@ -9516,7 +9552,7 @@
             <w:szCs w:val="24"/>
             <w:u w:val="single"/>
           </w:rPr>
-          <w:t xml:space="preserve">28</w:t>
+          <w:t xml:space="preserve">27</w:t>
         </w:r>
       </w:hyperlink>
       <w:r>
@@ -12056,7 +12092,7 @@
             <w:szCs w:val="24"/>
             <w:u w:val="single"/>
           </w:rPr>
-          <w:t xml:space="preserve">20</w:t>
+          <w:t xml:space="preserve">19</w:t>
         </w:r>
       </w:hyperlink>
       <w:r>
@@ -12646,7 +12682,7 @@
             <w:szCs w:val="24"/>
             <w:u w:val="single"/>
           </w:rPr>
-          <w:t xml:space="preserve">18</w:t>
+          <w:t xml:space="preserve">17</w:t>
         </w:r>
       </w:hyperlink>
       <w:r>
@@ -12680,7 +12716,7 @@
             <w:szCs w:val="24"/>
             <w:u w:val="single"/>
           </w:rPr>
-          <w:t xml:space="preserve">20</w:t>
+          <w:t xml:space="preserve">19</w:t>
         </w:r>
       </w:hyperlink>
       <w:r>
@@ -12711,7 +12747,7 @@
           <w:sz w:val="36"/>
           <w:szCs w:val="36"/>
         </w:rPr>
-        <w:t xml:space="preserve">18. Radiation Is Where Things Get Serious</w:t>
+        <w:t xml:space="preserve">17. Radiation Is Where Things Get Serious</w:t>
       </w:r>
       <w:bookmarkEnd w:id="1"/>
     </w:p>
@@ -13046,7 +13082,7 @@
           <w:sz w:val="36"/>
           <w:szCs w:val="36"/>
         </w:rPr>
-        <w:t xml:space="preserve">19. Where Is the Energy?</w:t>
+        <w:t xml:space="preserve">18. Where Is the Energy?</w:t>
       </w:r>
       <w:bookmarkEnd w:id="1"/>
     </w:p>
@@ -13659,7 +13695,7 @@
           <w:sz w:val="36"/>
           <w:szCs w:val="36"/>
         </w:rPr>
-        <w:t xml:space="preserve">20. What QED Adds</w:t>
+        <w:t xml:space="preserve">19. What QED Adds</w:t>
       </w:r>
       <w:bookmarkEnd w:id="1"/>
     </w:p>
@@ -13829,7 +13865,7 @@
             <w:szCs w:val="24"/>
             <w:u w:val="single"/>
           </w:rPr>
-          <w:t xml:space="preserve">47</w:t>
+          <w:t xml:space="preserve">46</w:t>
         </w:r>
       </w:hyperlink>
       <w:r>
@@ -14201,7 +14237,7 @@
           <w:sz w:val="36"/>
           <w:szCs w:val="36"/>
         </w:rPr>
-        <w:t xml:space="preserve">21. The Geometry of the Potential</w:t>
+        <w:t xml:space="preserve">20. The Geometry of the Potential</w:t>
       </w:r>
       <w:bookmarkEnd w:id="1"/>
     </w:p>
@@ -14494,7 +14530,7 @@
           <w:sz w:val="36"/>
           <w:szCs w:val="36"/>
         </w:rPr>
-        <w:t xml:space="preserve">22. The Art of Forgetting</w:t>
+        <w:t xml:space="preserve">21. The Art of Forgetting</w:t>
       </w:r>
       <w:bookmarkEnd w:id="1"/>
     </w:p>
@@ -14679,7 +14715,7 @@
           <w:sz w:val="36"/>
           <w:szCs w:val="36"/>
         </w:rPr>
-        <w:t xml:space="preserve">23. The Meaning of “Fundamental”</w:t>
+        <w:t xml:space="preserve">22. The Meaning of “Fundamental”</w:t>
       </w:r>
       <w:bookmarkEnd w:id="1"/>
     </w:p>
@@ -15003,7 +15039,7 @@
             <w:szCs w:val="24"/>
             <w:u w:val="single"/>
           </w:rPr>
-          <w:t xml:space="preserve">47</w:t>
+          <w:t xml:space="preserve">46</w:t>
         </w:r>
       </w:hyperlink>
       <w:r>
@@ -15156,7 +15192,7 @@
           <w:sz w:val="36"/>
           <w:szCs w:val="36"/>
         </w:rPr>
-        <w:t xml:space="preserve">24. Charge Is the Price of Changing Phase Locally</w:t>
+        <w:t xml:space="preserve">23. Charge Is the Price of Changing Phase Locally</w:t>
       </w:r>
       <w:bookmarkEnd w:id="1"/>
     </w:p>
@@ -15196,7 +15232,7 @@
             <w:szCs w:val="24"/>
             <w:u w:val="single"/>
           </w:rPr>
-          <w:t xml:space="preserve">21</w:t>
+          <w:t xml:space="preserve">20</w:t>
         </w:r>
       </w:hyperlink>
       <w:r>
@@ -15262,7 +15298,7 @@
             <w:szCs w:val="24"/>
             <w:u w:val="single"/>
           </w:rPr>
-          <w:t xml:space="preserve">21</w:t>
+          <w:t xml:space="preserve">20</w:t>
         </w:r>
       </w:hyperlink>
       <w:r>
@@ -15296,7 +15332,7 @@
             <w:szCs w:val="24"/>
             <w:u w:val="single"/>
           </w:rPr>
-          <w:t xml:space="preserve">21</w:t>
+          <w:t xml:space="preserve">20</w:t>
         </w:r>
       </w:hyperlink>
       <w:r>
@@ -15439,7 +15475,7 @@
             <w:szCs w:val="24"/>
             <w:u w:val="single"/>
           </w:rPr>
-          <w:t xml:space="preserve">25</w:t>
+          <w:t xml:space="preserve">24</w:t>
         </w:r>
       </w:hyperlink>
       <w:r>
@@ -15639,7 +15675,7 @@
           <w:sz w:val="36"/>
           <w:szCs w:val="36"/>
         </w:rPr>
-        <w:t xml:space="preserve">25. Why the Classical Path Wins</w:t>
+        <w:t xml:space="preserve">24. Why the Classical Path Wins</w:t>
       </w:r>
       <w:bookmarkEnd w:id="1"/>
     </w:p>
@@ -16006,7 +16042,7 @@
           <w:sz w:val="36"/>
           <w:szCs w:val="36"/>
         </w:rPr>
-        <w:t xml:space="preserve">26. Magnetism, Light, and Empty Space</w:t>
+        <w:t xml:space="preserve">25. Magnetism, Light, and Empty Space</w:t>
       </w:r>
       <w:bookmarkEnd w:id="1"/>
     </w:p>
@@ -16456,7 +16492,7 @@
           <w:sz w:val="36"/>
           <w:szCs w:val="36"/>
         </w:rPr>
-        <w:t xml:space="preserve">27. The Phase Can Wind</w:t>
+        <w:t xml:space="preserve">26. The Phase Can Wind</w:t>
       </w:r>
       <w:bookmarkEnd w:id="1"/>
     </w:p>
@@ -17007,7 +17043,7 @@
           <w:sz w:val="36"/>
           <w:szCs w:val="36"/>
         </w:rPr>
-        <w:t xml:space="preserve">28. The Equation Behind the Conversation</w:t>
+        <w:t xml:space="preserve">27. The Equation Behind the Conversation</w:t>
       </w:r>
       <w:bookmarkEnd w:id="1"/>
     </w:p>
@@ -17543,7 +17579,7 @@
             <w:szCs w:val="24"/>
             <w:u w:val="single"/>
           </w:rPr>
-          <w:t xml:space="preserve">21</w:t>
+          <w:t xml:space="preserve">20</w:t>
         </w:r>
       </w:hyperlink>
       <w:r>
@@ -17936,7 +17972,7 @@
             <w:szCs w:val="24"/>
             <w:u w:val="single"/>
           </w:rPr>
-          <w:t xml:space="preserve">24</w:t>
+          <w:t xml:space="preserve">23</w:t>
         </w:r>
       </w:hyperlink>
       <w:r>
@@ -18237,7 +18273,7 @@
           <w:sz w:val="36"/>
           <w:szCs w:val="36"/>
         </w:rPr>
-        <w:t xml:space="preserve">29. Feynman’s Diagrams Become Less Mysterious</w:t>
+        <w:t xml:space="preserve">28. Feynman’s Diagrams Become Less Mysterious</w:t>
       </w:r>
       <w:bookmarkEnd w:id="1"/>
     </w:p>
@@ -18590,7 +18626,7 @@
           <w:sz w:val="36"/>
           <w:szCs w:val="36"/>
         </w:rPr>
-        <w:t xml:space="preserve">30. The Classical Coulomb Force Emerges</w:t>
+        <w:t xml:space="preserve">29. The Classical Coulomb Force Emerges</w:t>
       </w:r>
       <w:bookmarkEnd w:id="1"/>
     </w:p>
@@ -18950,7 +18986,7 @@
             <w:szCs w:val="24"/>
             <w:u w:val="single"/>
           </w:rPr>
-          <w:t xml:space="preserve">26</w:t>
+          <w:t xml:space="preserve">25</w:t>
         </w:r>
       </w:hyperlink>
       <w:r>
@@ -19282,7 +19318,7 @@
             <w:szCs w:val="24"/>
             <w:u w:val="single"/>
           </w:rPr>
-          <w:t xml:space="preserve">21</w:t>
+          <w:t xml:space="preserve">20</w:t>
         </w:r>
       </w:hyperlink>
       <w:r>
@@ -19348,7 +19384,7 @@
             <w:szCs w:val="24"/>
             <w:u w:val="single"/>
           </w:rPr>
-          <w:t xml:space="preserve">25</w:t>
+          <w:t xml:space="preserve">24</w:t>
         </w:r>
       </w:hyperlink>
       <w:r>
@@ -19379,7 +19415,7 @@
           <w:sz w:val="36"/>
           <w:szCs w:val="36"/>
         </w:rPr>
-        <w:t xml:space="preserve">31. Now Add Many Electrons</w:t>
+        <w:t xml:space="preserve">30. Now Add Many Electrons</w:t>
       </w:r>
       <w:bookmarkEnd w:id="1"/>
     </w:p>
@@ -19632,7 +19668,7 @@
             <w:szCs w:val="24"/>
             <w:u w:val="single"/>
           </w:rPr>
-          <w:t xml:space="preserve">30</w:t>
+          <w:t xml:space="preserve">29</w:t>
         </w:r>
       </w:hyperlink>
       <w:r>
@@ -19740,7 +19776,7 @@
             <w:szCs w:val="24"/>
             <w:u w:val="single"/>
           </w:rPr>
-          <w:t xml:space="preserve">21</w:t>
+          <w:t xml:space="preserve">20</w:t>
         </w:r>
       </w:hyperlink>
       <w:r>
@@ -19839,7 +19875,7 @@
           <w:sz w:val="36"/>
           <w:szCs w:val="36"/>
         </w:rPr>
-        <w:t xml:space="preserve">32. The Book’s Central Bridge</w:t>
+        <w:t xml:space="preserve">31. The Book’s Central Bridge</w:t>
       </w:r>
       <w:bookmarkEnd w:id="1"/>
     </w:p>
@@ -19951,7 +19987,7 @@
             <w:szCs w:val="24"/>
             <w:u w:val="single"/>
           </w:rPr>
-          <w:t xml:space="preserve">28</w:t>
+          <w:t xml:space="preserve">27</w:t>
         </w:r>
       </w:hyperlink>
       <w:r>
@@ -20282,7 +20318,7 @@
           <w:sz w:val="36"/>
           <w:szCs w:val="36"/>
         </w:rPr>
-        <w:t xml:space="preserve">33. The Photon Is Not the Opposite of the Phase</w:t>
+        <w:t xml:space="preserve">32. The Photon Is Not the Opposite of the Phase</w:t>
       </w:r>
       <w:bookmarkEnd w:id="1"/>
     </w:p>
@@ -20322,7 +20358,7 @@
             <w:szCs w:val="24"/>
             <w:u w:val="single"/>
           </w:rPr>
-          <w:t xml:space="preserve">28</w:t>
+          <w:t xml:space="preserve">27</w:t>
         </w:r>
       </w:hyperlink>
       <w:r>
@@ -20372,7 +20408,7 @@
             <w:szCs w:val="24"/>
             <w:u w:val="single"/>
           </w:rPr>
-          <w:t xml:space="preserve">21</w:t>
+          <w:t xml:space="preserve">20</w:t>
         </w:r>
       </w:hyperlink>
       <w:r>
@@ -20577,7 +20613,7 @@
             <w:szCs w:val="24"/>
             <w:u w:val="single"/>
           </w:rPr>
-          <w:t xml:space="preserve">29</w:t>
+          <w:t xml:space="preserve">28</w:t>
         </w:r>
       </w:hyperlink>
       <w:r>
@@ -20672,7 +20708,7 @@
           <w:sz w:val="36"/>
           <w:szCs w:val="36"/>
         </w:rPr>
-        <w:t xml:space="preserve">34. When Matter Meets Light</w:t>
+        <w:t xml:space="preserve">33. When Matter Meets Light</w:t>
       </w:r>
       <w:bookmarkEnd w:id="1"/>
     </w:p>
@@ -20760,7 +20796,7 @@
             <w:szCs w:val="24"/>
             <w:u w:val="single"/>
           </w:rPr>
-          <w:t xml:space="preserve">26</w:t>
+          <w:t xml:space="preserve">25</w:t>
         </w:r>
       </w:hyperlink>
       <w:r>
@@ -20961,7 +20997,7 @@
           <w:sz w:val="36"/>
           <w:szCs w:val="36"/>
         </w:rPr>
-        <w:t xml:space="preserve">35. The Loop, Formalized</w:t>
+        <w:t xml:space="preserve">34. The Loop, Formalized</w:t>
       </w:r>
       <w:bookmarkEnd w:id="1"/>
     </w:p>
@@ -21247,7 +21283,7 @@
           <w:sz w:val="36"/>
           <w:szCs w:val="36"/>
         </w:rPr>
-        <w:t xml:space="preserve">36. Vacuum Polarization: The Electron Is Not Quite Alone</w:t>
+        <w:t xml:space="preserve">35. Vacuum Polarization: The Electron Is Not Quite Alone</w:t>
       </w:r>
       <w:bookmarkEnd w:id="1"/>
     </w:p>
@@ -21610,7 +21646,7 @@
           <w:sz w:val="36"/>
           <w:szCs w:val="36"/>
         </w:rPr>
-        <w:t xml:space="preserve">37. The Terrible Reputation of Renormalization</w:t>
+        <w:t xml:space="preserve">36. The Terrible Reputation of Renormalization</w:t>
       </w:r>
       <w:bookmarkEnd w:id="1"/>
     </w:p>
@@ -22402,7 +22438,7 @@
           <w:sz w:val="36"/>
           <w:szCs w:val="36"/>
         </w:rPr>
-        <w:t xml:space="preserve">38. A Resolution Dial</w:t>
+        <w:t xml:space="preserve">37. A Resolution Dial</w:t>
       </w:r>
       <w:bookmarkEnd w:id="1"/>
     </w:p>
@@ -22494,7 +22530,7 @@
             <w:szCs w:val="24"/>
             <w:u w:val="single"/>
           </w:rPr>
-          <w:t xml:space="preserve">37</w:t>
+          <w:t xml:space="preserve">36</w:t>
         </w:r>
       </w:hyperlink>
       <w:r>
@@ -22829,7 +22865,7 @@
           <w:sz w:val="36"/>
           <w:szCs w:val="36"/>
         </w:rPr>
-        <w:t xml:space="preserve">39. Renormalization Is a Translation System</w:t>
+        <w:t xml:space="preserve">38. Renormalization Is a Translation System</w:t>
       </w:r>
       <w:bookmarkEnd w:id="1"/>
     </w:p>
@@ -22997,7 +23033,7 @@
             <w:szCs w:val="24"/>
             <w:u w:val="single"/>
           </w:rPr>
-          <w:t xml:space="preserve">34</w:t>
+          <w:t xml:space="preserve">33</w:t>
         </w:r>
       </w:hyperlink>
       <w:r>
@@ -23262,7 +23298,7 @@
           <w:sz w:val="36"/>
           <w:szCs w:val="36"/>
         </w:rPr>
-        <w:t xml:space="preserve">40. From QED to a Superconducting Circuit</w:t>
+        <w:t xml:space="preserve">39. From QED to a Superconducting Circuit</w:t>
       </w:r>
       <w:bookmarkEnd w:id="1"/>
     </w:p>
@@ -23368,7 +23404,7 @@
             <w:szCs w:val="24"/>
             <w:u w:val="single"/>
           </w:rPr>
-          <w:t xml:space="preserve">32</w:t>
+          <w:t xml:space="preserve">31</w:t>
         </w:r>
       </w:hyperlink>
       <w:r>
@@ -23434,7 +23470,7 @@
             <w:szCs w:val="24"/>
             <w:u w:val="single"/>
           </w:rPr>
-          <w:t xml:space="preserve">31</w:t>
+          <w:t xml:space="preserve">30</w:t>
         </w:r>
       </w:hyperlink>
       <w:r>
@@ -23656,7 +23692,7 @@
             <w:szCs w:val="24"/>
             <w:u w:val="single"/>
           </w:rPr>
-          <w:t xml:space="preserve">31</w:t>
+          <w:t xml:space="preserve">30</w:t>
         </w:r>
       </w:hyperlink>
       <w:r>
@@ -24193,7 +24229,7 @@
           <w:sz w:val="36"/>
           <w:szCs w:val="36"/>
         </w:rPr>
-        <w:t xml:space="preserve">41. One System, Several Descriptions</w:t>
+        <w:t xml:space="preserve">40. One System, Several Descriptions</w:t>
       </w:r>
       <w:bookmarkEnd w:id="1"/>
     </w:p>
@@ -24420,7 +24456,7 @@
             <w:szCs w:val="24"/>
             <w:u w:val="single"/>
           </w:rPr>
-          <w:t xml:space="preserve">26</w:t>
+          <w:t xml:space="preserve">25</w:t>
         </w:r>
       </w:hyperlink>
       <w:r>
@@ -24431,7 +24467,7 @@
           <w:sz w:val="24"/>
           <w:szCs w:val="24"/>
         </w:rPr>
-        <w:t xml:space="preserve"> and 34 already established. Even in the naive classical sense, the cavity is never truly empty: it contains a genuine quantum electromagnetic mode sitting in its ground state, and once again there’s no need to picture tiny photons bouncing around inside an ostensibly empty box — the vacuum state itself is the relevant quantum object doing the work.</w:t>
+        <w:t xml:space="preserve"> and 33 already established. Even in the naive classical sense, the cavity is never truly empty: it contains a genuine quantum electromagnetic mode sitting in its ground state, and once again there’s no need to picture tiny photons bouncing around inside an ostensibly empty box — the vacuum state itself is the relevant quantum object doing the work.</w:t>
       </w:r>
     </w:p>
     <w:p>
@@ -24567,7 +24603,7 @@
           <w:sz w:val="36"/>
           <w:szCs w:val="36"/>
         </w:rPr>
-        <w:t xml:space="preserve">42. The Same Wire Contains All Four Worlds</w:t>
+        <w:t xml:space="preserve">41. The Same Wire Contains All Four Worlds</w:t>
       </w:r>
       <w:bookmarkEnd w:id="1"/>
     </w:p>
@@ -24719,7 +24755,7 @@
             <w:szCs w:val="24"/>
             <w:u w:val="single"/>
           </w:rPr>
-          <w:t xml:space="preserve">47</w:t>
+          <w:t xml:space="preserve">46</w:t>
         </w:r>
       </w:hyperlink>
       <w:r>
@@ -24792,7 +24828,7 @@
           <w:sz w:val="36"/>
           <w:szCs w:val="36"/>
         </w:rPr>
-        <w:t xml:space="preserve">43. A Tiny Charge With a Huge Story</w:t>
+        <w:t xml:space="preserve">42. A Tiny Charge With a Huge Story</w:t>
       </w:r>
       <w:bookmarkEnd w:id="1"/>
     </w:p>
@@ -24832,7 +24868,7 @@
             <w:szCs w:val="24"/>
             <w:u w:val="single"/>
           </w:rPr>
-          <w:t xml:space="preserve">37</w:t>
+          <w:t xml:space="preserve">36</w:t>
         </w:r>
       </w:hyperlink>
       <w:r>
@@ -24914,7 +24950,7 @@
             <w:szCs w:val="24"/>
             <w:u w:val="single"/>
           </w:rPr>
-          <w:t xml:space="preserve">30</w:t>
+          <w:t xml:space="preserve">29</w:t>
         </w:r>
       </w:hyperlink>
       <w:r>
@@ -25137,7 +25173,7 @@
           <w:sz w:val="36"/>
           <w:szCs w:val="36"/>
         </w:rPr>
-        <w:t xml:space="preserve">44. The Electron in a Superconductor</w:t>
+        <w:t xml:space="preserve">43. The Electron in a Superconductor</w:t>
       </w:r>
       <w:bookmarkEnd w:id="1"/>
     </w:p>
@@ -25211,7 +25247,7 @@
             <w:szCs w:val="24"/>
             <w:u w:val="single"/>
           </w:rPr>
-          <w:t xml:space="preserve">38</w:t>
+          <w:t xml:space="preserve">37</w:t>
         </w:r>
       </w:hyperlink>
       <w:r>
@@ -25439,7 +25475,7 @@
             <w:szCs w:val="24"/>
             <w:u w:val="single"/>
           </w:rPr>
-          <w:t xml:space="preserve">32</w:t>
+          <w:t xml:space="preserve">31</w:t>
         </w:r>
       </w:hyperlink>
       <w:r>
@@ -25502,7 +25538,7 @@
           <w:sz w:val="36"/>
           <w:szCs w:val="36"/>
         </w:rPr>
-        <w:t xml:space="preserve">45. Is the Field Real?</w:t>
+        <w:t xml:space="preserve">44. Is the Field Real?</w:t>
       </w:r>
       <w:bookmarkEnd w:id="1"/>
     </w:p>
@@ -25630,7 +25666,7 @@
             <w:szCs w:val="24"/>
             <w:u w:val="single"/>
           </w:rPr>
-          <w:t xml:space="preserve">30</w:t>
+          <w:t xml:space="preserve">29</w:t>
         </w:r>
       </w:hyperlink>
       <w:r>
@@ -25778,7 +25814,7 @@
             <w:szCs w:val="24"/>
             <w:u w:val="single"/>
           </w:rPr>
-          <w:t xml:space="preserve">19</w:t>
+          <w:t xml:space="preserve">18</w:t>
         </w:r>
       </w:hyperlink>
       <w:r>
@@ -25908,7 +25944,7 @@
             <w:szCs w:val="24"/>
             <w:u w:val="single"/>
           </w:rPr>
-          <w:t xml:space="preserve">26</w:t>
+          <w:t xml:space="preserve">25</w:t>
         </w:r>
       </w:hyperlink>
       <w:r>
@@ -25990,7 +26026,7 @@
             <w:szCs w:val="24"/>
             <w:u w:val="single"/>
           </w:rPr>
-          <w:t xml:space="preserve">23</w:t>
+          <w:t xml:space="preserve">22</w:t>
         </w:r>
       </w:hyperlink>
       <w:r>
@@ -26131,7 +26167,7 @@
           <w:sz w:val="36"/>
           <w:szCs w:val="36"/>
         </w:rPr>
-        <w:t xml:space="preserve">46. The Ladder of Descriptions: Electron to Eye</w:t>
+        <w:t xml:space="preserve">45. The Ladder of Descriptions: Electron to Eye</w:t>
       </w:r>
       <w:bookmarkEnd w:id="1"/>
     </w:p>
@@ -26381,7 +26417,7 @@
             <w:szCs w:val="24"/>
             <w:u w:val="single"/>
           </w:rPr>
-          <w:t xml:space="preserve">22</w:t>
+          <w:t xml:space="preserve">21</w:t>
         </w:r>
       </w:hyperlink>
       <w:r>
@@ -26451,7 +26487,7 @@
             <w:szCs w:val="24"/>
             <w:u w:val="single"/>
           </w:rPr>
-          <w:t xml:space="preserve">31</w:t>
+          <w:t xml:space="preserve">30</w:t>
         </w:r>
       </w:hyperlink>
       <w:r>
@@ -26535,7 +26571,7 @@
             <w:szCs w:val="24"/>
             <w:u w:val="single"/>
           </w:rPr>
-          <w:t xml:space="preserve">40</w:t>
+          <w:t xml:space="preserve">39</w:t>
         </w:r>
       </w:hyperlink>
       <w:r>
@@ -26575,6 +26611,40 @@
         <w:t xml:space="preserve">Chapter </w:t>
       </w:r>
       <w:hyperlink w:history="1" w:anchor="toc51">
+        <w:r>
+          <w:rPr>
+            <w:rFonts w:ascii="Cambria" w:cs="Cambria" w:eastAsia="Cambria" w:hAnsi="Cambria"/>
+            <w:i w:val="false"/>
+            <w:iCs w:val="false"/>
+            <w:color w:val="44546A"/>
+            <w:sz w:val="24"/>
+            <w:szCs w:val="24"/>
+            <w:u w:val="single"/>
+          </w:rPr>
+          <w:t xml:space="preserve">39</w:t>
+        </w:r>
+      </w:hyperlink>
+      <w:r>
+        <w:rPr>
+          <w:rFonts w:ascii="Cambria" w:cs="Cambria" w:eastAsia="Cambria" w:hAnsi="Cambria"/>
+          <w:i w:val="false"/>
+          <w:iCs w:val="false"/>
+          <w:sz w:val="24"/>
+          <w:szCs w:val="24"/>
+        </w:rPr>
+        <w:t xml:space="preserve">’s artificial atom meeting </w:t>
+      </w:r>
+      <w:r>
+        <w:rPr>
+          <w:rFonts w:ascii="Cambria" w:cs="Cambria" w:eastAsia="Cambria" w:hAnsi="Cambria"/>
+          <w:i w:val="false"/>
+          <w:iCs w:val="false"/>
+          <w:sz w:val="24"/>
+          <w:szCs w:val="24"/>
+        </w:rPr>
+        <w:t xml:space="preserve">Chapter </w:t>
+      </w:r>
+      <w:hyperlink w:history="1" w:anchor="toc52">
         <w:r>
           <w:rPr>
             <w:rFonts w:ascii="Cambria" w:cs="Cambria" w:eastAsia="Cambria" w:hAnsi="Cambria"/>
@@ -26596,40 +26666,6 @@
           <w:sz w:val="24"/>
           <w:szCs w:val="24"/>
         </w:rPr>
-        <w:t xml:space="preserve">’s artificial atom meeting </w:t>
-      </w:r>
-      <w:r>
-        <w:rPr>
-          <w:rFonts w:ascii="Cambria" w:cs="Cambria" w:eastAsia="Cambria" w:hAnsi="Cambria"/>
-          <w:i w:val="false"/>
-          <w:iCs w:val="false"/>
-          <w:sz w:val="24"/>
-          <w:szCs w:val="24"/>
-        </w:rPr>
-        <w:t xml:space="preserve">Chapter </w:t>
-      </w:r>
-      <w:hyperlink w:history="1" w:anchor="toc52">
-        <w:r>
-          <w:rPr>
-            <w:rFonts w:ascii="Cambria" w:cs="Cambria" w:eastAsia="Cambria" w:hAnsi="Cambria"/>
-            <w:i w:val="false"/>
-            <w:iCs w:val="false"/>
-            <w:color w:val="44546A"/>
-            <w:sz w:val="24"/>
-            <w:szCs w:val="24"/>
-            <w:u w:val="single"/>
-          </w:rPr>
-          <w:t xml:space="preserve">41</w:t>
-        </w:r>
-      </w:hyperlink>
-      <w:r>
-        <w:rPr>
-          <w:rFonts w:ascii="Cambria" w:cs="Cambria" w:eastAsia="Cambria" w:hAnsi="Cambria"/>
-          <w:i w:val="false"/>
-          <w:iCs w:val="false"/>
-          <w:sz w:val="24"/>
-          <w:szCs w:val="24"/>
-        </w:rPr>
         <w:t xml:space="preserve">’s quantized cavity mode in one piece of laboratory apparatus. The collective matter phase and the quantized electromagnetic field coexist here with no philosophical tension between them: two different degrees of freedom belonging to one physical system, not competing descriptions of the same thing.</w:t>
       </w:r>
     </w:p>
@@ -26746,7 +26782,7 @@
           <w:sz w:val="36"/>
           <w:szCs w:val="36"/>
         </w:rPr>
-        <w:t xml:space="preserve">47. What We Have Learned, and What We Have Not Proven</w:t>
+        <w:t xml:space="preserve">46. What We Have Learned, and What We Have Not Proven</w:t>
       </w:r>
       <w:bookmarkEnd w:id="1"/>
     </w:p>
@@ -26776,7 +26812,7 @@
             <w:szCs w:val="24"/>
             <w:u w:val="single"/>
           </w:rPr>
-          <w:t xml:space="preserve">45</w:t>
+          <w:t xml:space="preserve">44</w:t>
         </w:r>
       </w:hyperlink>
       <w:r>
@@ -26944,7 +26980,7 @@
             <w:szCs w:val="24"/>
             <w:u w:val="single"/>
           </w:rPr>
-          <w:t xml:space="preserve">25</w:t>
+          <w:t xml:space="preserve">24</w:t>
         </w:r>
       </w:hyperlink>
       <w:r>
@@ -27404,7 +27440,7 @@
             <w:szCs w:val="24"/>
             <w:u w:val="single"/>
           </w:rPr>
-          <w:t xml:space="preserve">26</w:t>
+          <w:t xml:space="preserve">25</w:t>
         </w:r>
       </w:hyperlink>
       <w:r>
@@ -27483,7 +27519,7 @@
           <w:sz w:val="36"/>
           <w:szCs w:val="36"/>
         </w:rPr>
-        <w:t xml:space="preserve">48. Epilogue: The Law Becomes Visible</w:t>
+        <w:t xml:space="preserve">47. Epilogue: The Law Becomes Visible</w:t>
       </w:r>
       <w:bookmarkEnd w:id="1"/>
     </w:p>
@@ -27539,7 +27575,7 @@
             <w:szCs w:val="24"/>
             <w:u w:val="single"/>
           </w:rPr>
-          <w:t xml:space="preserve">47</w:t>
+          <w:t xml:space="preserve">46</w:t>
         </w:r>
       </w:hyperlink>
       <w:r>
@@ -28131,7 +28167,7 @@
             <w:szCs w:val="20"/>
             <w:u w:val="single"/>
           </w:rPr>
-          <w:t xml:space="preserve">18</w:t>
+          <w:t xml:space="preserve">17</w:t>
         </w:r>
       </w:hyperlink>
       <w:r>
@@ -28155,7 +28191,7 @@
             <w:szCs w:val="20"/>
             <w:u w:val="single"/>
           </w:rPr>
-          <w:t xml:space="preserve">19</w:t>
+          <w:t xml:space="preserve">18</w:t>
         </w:r>
       </w:hyperlink>
       <w:r>
@@ -28279,7 +28315,7 @@
             <w:szCs w:val="20"/>
             <w:u w:val="single"/>
           </w:rPr>
-          <w:t xml:space="preserve">19</w:t>
+          <w:t xml:space="preserve">18</w:t>
         </w:r>
       </w:hyperlink>
       <w:r>
@@ -28437,7 +28473,7 @@
             <w:szCs w:val="20"/>
             <w:u w:val="single"/>
           </w:rPr>
-          <w:t xml:space="preserve">25</w:t>
+          <w:t xml:space="preserve">24</w:t>
         </w:r>
       </w:hyperlink>
       <w:r>
@@ -28543,7 +28579,7 @@
             <w:szCs w:val="20"/>
             <w:u w:val="single"/>
           </w:rPr>
-          <w:t xml:space="preserve">28</w:t>
+          <w:t xml:space="preserve">27</w:t>
         </w:r>
       </w:hyperlink>
       <w:r>
@@ -28692,7 +28728,7 @@
             <w:szCs w:val="24"/>
             <w:u w:val="single"/>
           </w:rPr>
-          <w:t xml:space="preserve">28</w:t>
+          <w:t xml:space="preserve">27</w:t>
         </w:r>
       </w:hyperlink>
       <w:r>
@@ -28776,7 +28812,7 @@
             <w:szCs w:val="20"/>
             <w:u w:val="single"/>
           </w:rPr>
-          <w:t xml:space="preserve">30</w:t>
+          <w:t xml:space="preserve">29</w:t>
         </w:r>
       </w:hyperlink>
       <w:r>
@@ -28900,7 +28936,7 @@
             <w:szCs w:val="20"/>
             <w:u w:val="single"/>
           </w:rPr>
-          <w:t xml:space="preserve">32</w:t>
+          <w:t xml:space="preserve">31</w:t>
         </w:r>
       </w:hyperlink>
       <w:r>
@@ -28976,7 +29012,7 @@
             <w:szCs w:val="24"/>
             <w:u w:val="single"/>
           </w:rPr>
-          <w:t xml:space="preserve">28</w:t>
+          <w:t xml:space="preserve">27</w:t>
         </w:r>
       </w:hyperlink>
       <w:r>
@@ -29040,7 +29076,7 @@
             <w:szCs w:val="20"/>
             <w:u w:val="single"/>
           </w:rPr>
-          <w:t xml:space="preserve">35</w:t>
+          <w:t xml:space="preserve">34</w:t>
         </w:r>
       </w:hyperlink>
       <w:r>
@@ -29201,7 +29237,7 @@
             <w:szCs w:val="20"/>
             <w:u w:val="single"/>
           </w:rPr>
-          <w:t xml:space="preserve">37</w:t>
+          <w:t xml:space="preserve">36</w:t>
         </w:r>
       </w:hyperlink>
       <w:r>
@@ -29379,7 +29415,7 @@
             <w:szCs w:val="20"/>
             <w:u w:val="single"/>
           </w:rPr>
-          <w:t xml:space="preserve">38</w:t>
+          <w:t xml:space="preserve">37</w:t>
         </w:r>
       </w:hyperlink>
       <w:r>
@@ -29485,7 +29521,7 @@
             <w:szCs w:val="20"/>
             <w:u w:val="single"/>
           </w:rPr>
-          <w:t xml:space="preserve">40</w:t>
+          <w:t xml:space="preserve">39</w:t>
         </w:r>
       </w:hyperlink>
       <w:r>
@@ -29776,7 +29812,7 @@
         </w:rPr>
         <w:t xml:space="preserve"> 115, 485, 1959), </w:t>
       </w:r>
-      <w:hyperlink w:history="1" r:id="rId1ndjahyrmibfg9pyalv6x">
+      <w:hyperlink w:history="1" r:id="rId2wkew0protf93i1smwhaq">
         <w:r>
           <w:rPr>
             <w:rFonts w:ascii="Cambria" w:cs="Cambria" w:eastAsia="Cambria" w:hAnsi="Cambria"/>
@@ -29820,7 +29856,7 @@
         </w:rPr>
         <w:t xml:space="preserve"> 56, 792, 1986), </w:t>
       </w:r>
-      <w:hyperlink w:history="1" r:id="rIdu8irslip5lh9jh6egfcdf">
+      <w:hyperlink w:history="1" r:id="rId0ccxog3l_lnhdz1eo8iju">
         <w:r>
           <w:rPr>
             <w:rFonts w:ascii="Cambria" w:cs="Cambria" w:eastAsia="Cambria" w:hAnsi="Cambria"/>
@@ -29964,7 +30000,7 @@
         </w:rPr>
         <w:t xml:space="preserve">, 1905), </w:t>
       </w:r>
-      <w:hyperlink w:history="1" r:id="rIdmqlmrrcf6w3cwdegqtagy">
+      <w:hyperlink w:history="1" r:id="rIdwasqcsvxl0t8_zbq6ufzd">
         <w:r>
           <w:rPr>
             <w:rFonts w:ascii="Cambria" w:cs="Cambria" w:eastAsia="Cambria" w:hAnsi="Cambria"/>
@@ -30036,7 +30072,7 @@
         </w:rPr>
         <w:t xml:space="preserve"> 20, 367, 1948), </w:t>
       </w:r>
-      <w:hyperlink w:history="1" r:id="rIdczkkd3rva3za1cwcs9mpd">
+      <w:hyperlink w:history="1" r:id="rIdifivkhevnqc3rtkpdqpdh">
         <w:r>
           <w:rPr>
             <w:rFonts w:ascii="Cambria" w:cs="Cambria" w:eastAsia="Cambria" w:hAnsi="Cambria"/>
@@ -30098,7 +30134,7 @@
         </w:rPr>
         <w:t xml:space="preserve"> 17, 157, 1945), </w:t>
       </w:r>
-      <w:hyperlink w:history="1" r:id="rIdgplxcu-e6yh-olbfarudm">
+      <w:hyperlink w:history="1" r:id="rIdt92pghhxdbb5hvwot8fpi">
         <w:r>
           <w:rPr>
             <w:rFonts w:ascii="Cambria" w:cs="Cambria" w:eastAsia="Cambria" w:hAnsi="Cambria"/>
@@ -30142,7 +30178,7 @@
         </w:rPr>
         <w:t xml:space="preserve"> 21, 425, 1949), </w:t>
       </w:r>
-      <w:hyperlink w:history="1" r:id="rIddkalpryi1pmrvupvhprfo">
+      <w:hyperlink w:history="1" r:id="rIdocppryhrtetvczcjf8xnb">
         <w:r>
           <w:rPr>
             <w:rFonts w:ascii="Cambria" w:cs="Cambria" w:eastAsia="Cambria" w:hAnsi="Cambria"/>
@@ -30204,7 +30240,7 @@
         </w:rPr>
         <w:t xml:space="preserve"> 72, 241, 1947), </w:t>
       </w:r>
-      <w:hyperlink w:history="1" r:id="rIdgsfzbd4ml38zwczfpcy2g">
+      <w:hyperlink w:history="1" r:id="rIdvxszt--c3qyftbrkchwxf">
         <w:r>
           <w:rPr>
             <w:rFonts w:ascii="Cambria" w:cs="Cambria" w:eastAsia="Cambria" w:hAnsi="Cambria"/>
@@ -30296,7 +30332,7 @@
         </w:rPr>
         <w:t xml:space="preserve"> 1, 186 (1971), </w:t>
       </w:r>
-      <w:hyperlink w:history="1" r:id="rIdrkmgexar9flujr_fi8exw">
+      <w:hyperlink w:history="1" r:id="rIdebcshntpvgfpig5-_qnhw">
         <w:r>
           <w:rPr>
             <w:rFonts w:ascii="Cambria" w:cs="Cambria" w:eastAsia="Cambria" w:hAnsi="Cambria"/>
@@ -30358,7 +30394,7 @@
         </w:rPr>
         <w:t xml:space="preserve"> B51, 793, 1948). The academy’s scan of that paper is at </w:t>
       </w:r>
-      <w:hyperlink w:history="1" r:id="rIdj0nvc8ov--jscfrnqq8px">
+      <w:hyperlink w:history="1" r:id="rIdbwysszii6gby9w3qllfft">
         <w:r>
           <w:rPr>
             <w:rFonts w:ascii="Cambria" w:cs="Cambria" w:eastAsia="Cambria" w:hAnsi="Cambria"/>
@@ -30402,7 +30438,7 @@
         </w:rPr>
         <w:t xml:space="preserve"> 78, 5, 1997), </w:t>
       </w:r>
-      <w:hyperlink w:history="1" r:id="rIdwgz9vyhdpntulymay1qiy">
+      <w:hyperlink w:history="1" r:id="rId1n6eppiqravrxnrgiylgk">
         <w:r>
           <w:rPr>
             <w:rFonts w:ascii="Cambria" w:cs="Cambria" w:eastAsia="Cambria" w:hAnsi="Cambria"/>
@@ -30464,7 +30500,7 @@
         </w:rPr>
         <w:t xml:space="preserve"> 5, 1174, 1957). The journal’s English PDF is at </w:t>
       </w:r>
-      <w:hyperlink w:history="1" r:id="rIdxdgsxa1z4tchfjewna0oc">
+      <w:hyperlink w:history="1" r:id="rIdkj9giy6az4vchgnqtmu3i">
         <w:r>
           <w:rPr>
             <w:rFonts w:ascii="Cambria" w:cs="Cambria" w:eastAsia="Cambria" w:hAnsi="Cambria"/>
@@ -30536,7 +30572,7 @@
         </w:rPr>
         <w:t xml:space="preserve"> 133, 60, 1931), </w:t>
       </w:r>
-      <w:hyperlink w:history="1" r:id="rId848zdpufgmmhhohpg7z36">
+      <w:hyperlink w:history="1" r:id="rIduzcyn7b3-cip9g-wwbhr-">
         <w:r>
           <w:rPr>
             <w:rFonts w:ascii="Cambria" w:cs="Cambria" w:eastAsia="Cambria" w:hAnsi="Cambria"/>
@@ -30609,7 +30645,7 @@
             <w:szCs w:val="24"/>
             <w:u w:val="single"/>
           </w:rPr>
-          <w:t xml:space="preserve">33</w:t>
+          <w:t xml:space="preserve">32</w:t>
         </w:r>
       </w:hyperlink>
       <w:r>
@@ -30642,7 +30678,7 @@
         </w:rPr>
         <w:t xml:space="preserve"> 1, 173, 1986), </w:t>
       </w:r>
-      <w:hyperlink w:history="1" r:id="rIdppx0yojjnhrakmh6cnxai">
+      <w:hyperlink w:history="1" r:id="rIdst1vjuetyxdkiyo0zznvi">
         <w:r>
           <w:rPr>
             <w:rFonts w:ascii="Cambria" w:cs="Cambria" w:eastAsia="Cambria" w:hAnsi="Cambria"/>
@@ -30724,7 +30760,7 @@
         </w:rPr>
         <w:t xml:space="preserve"> 73, 416, 1948), </w:t>
       </w:r>
-      <w:hyperlink w:history="1" r:id="rIdko-zne1osjx-juefxatam">
+      <w:hyperlink w:history="1" r:id="rIdrlzvjx5a7xuusepvngxnu">
         <w:r>
           <w:rPr>
             <w:rFonts w:ascii="Cambria" w:cs="Cambria" w:eastAsia="Cambria" w:hAnsi="Cambria"/>
@@ -30768,7 +30804,7 @@
         </w:rPr>
         <w:t xml:space="preserve"> 130, 071801, 2023), </w:t>
       </w:r>
-      <w:hyperlink w:history="1" r:id="rId-yxnb37v91rlnoqnd8qtu">
+      <w:hyperlink w:history="1" r:id="rId9hrprldvaandqu_q85uew">
         <w:r>
           <w:rPr>
             <w:rFonts w:ascii="Cambria" w:cs="Cambria" w:eastAsia="Cambria" w:hAnsi="Cambria"/>
@@ -30907,7 +30943,7 @@
         </w:rPr>
         <w:t xml:space="preserve"> 1, 251, 1962), </w:t>
       </w:r>
-      <w:hyperlink w:history="1" r:id="rIdgdhtop7zegusfevnu2-ks">
+      <w:hyperlink w:history="1" r:id="rId4la-mdt47w5qos5zlkwsc">
         <w:r>
           <w:rPr>
             <w:rFonts w:ascii="Cambria" w:cs="Cambria" w:eastAsia="Cambria" w:hAnsi="Cambria"/>
@@ -31197,7 +31233,7 @@
             <w:szCs w:val="24"/>
             <w:u w:val="single"/>
           </w:rPr>
-          <w:t xml:space="preserve">28</w:t>
+          <w:t xml:space="preserve">27</w:t>
         </w:r>
       </w:hyperlink>
       <w:r>
@@ -31230,7 +31266,7 @@
         </w:rPr>
         <w:t xml:space="preserve"> 93, 025005, 2021), </w:t>
       </w:r>
-      <w:hyperlink w:history="1" r:id="rIdg9ig_vezt_dbxvakxlkzz">
+      <w:hyperlink w:history="1" r:id="rIdkdabrhmp5nxqqifswhrc6">
         <w:r>
           <w:rPr>
             <w:rFonts w:ascii="Cambria" w:cs="Cambria" w:eastAsia="Cambria" w:hAnsi="Cambria"/>
@@ -31419,7 +31455,7 @@
           <w:sz w:val="24"/>
           <w:szCs w:val="24"/>
         </w:rPr>
-        <w:t xml:space="preserve"> and 25.</w:t>
+        <w:t xml:space="preserve"> and 24.</w:t>
       </w:r>
     </w:p>
     <w:p>
@@ -31539,7 +31575,7 @@
           <w:sz w:val="24"/>
           <w:szCs w:val="24"/>
         </w:rPr>
-        <w:t xml:space="preserve">, 3, and 30.</w:t>
+        <w:t xml:space="preserve">, 3, and 29.</w:t>
       </w:r>
     </w:p>
     <w:p>
@@ -31780,7 +31816,7 @@
             <w:szCs w:val="24"/>
             <w:u w:val="single"/>
           </w:rPr>
-          <w:t xml:space="preserve">37</w:t>
+          <w:t xml:space="preserve">36</w:t>
         </w:r>
       </w:hyperlink>
       <w:r>
@@ -31931,7 +31967,7 @@
           <w:sz w:val="24"/>
           <w:szCs w:val="24"/>
         </w:rPr>
-        <w:t xml:space="preserve"> and 30.</w:t>
+        <w:t xml:space="preserve"> and 29.</w:t>
       </w:r>
     </w:p>
     <w:p>
@@ -31991,7 +32027,7 @@
           <w:sz w:val="24"/>
           <w:szCs w:val="24"/>
         </w:rPr>
-        <w:t xml:space="preserve">, 6, and 32.</w:t>
+        <w:t xml:space="preserve">, 6, and 31.</w:t>
       </w:r>
     </w:p>
     <w:p>
@@ -32040,7 +32076,7 @@
             <w:szCs w:val="24"/>
             <w:u w:val="single"/>
           </w:rPr>
-          <w:t xml:space="preserve">20</w:t>
+          <w:t xml:space="preserve">19</w:t>
         </w:r>
       </w:hyperlink>
       <w:r>
@@ -32100,7 +32136,7 @@
             <w:szCs w:val="24"/>
             <w:u w:val="single"/>
           </w:rPr>
-          <w:t xml:space="preserve">21</w:t>
+          <w:t xml:space="preserve">20</w:t>
         </w:r>
       </w:hyperlink>
       <w:r>
@@ -32251,7 +32287,7 @@
           <w:sz w:val="24"/>
           <w:szCs w:val="24"/>
         </w:rPr>
-        <w:t xml:space="preserve"> and 40.</w:t>
+        <w:t xml:space="preserve"> and 39.</w:t>
       </w:r>
     </w:p>
     <w:p>
@@ -32310,6 +32346,366 @@
         <w:t xml:space="preserve">Chapter </w:t>
       </w:r>
       <w:hyperlink w:history="1" w:anchor="toc36">
+        <w:r>
+          <w:rPr>
+            <w:rFonts w:ascii="Cambria" w:cs="Cambria" w:eastAsia="Cambria" w:hAnsi="Cambria"/>
+            <w:i w:val="false"/>
+            <w:iCs w:val="false"/>
+            <w:color w:val="44546A"/>
+            <w:sz w:val="24"/>
+            <w:szCs w:val="24"/>
+            <w:u w:val="single"/>
+          </w:rPr>
+          <w:t xml:space="preserve">27</w:t>
+        </w:r>
+      </w:hyperlink>
+      <w:r>
+        <w:rPr>
+          <w:rFonts w:ascii="Cambria" w:cs="Cambria" w:eastAsia="Cambria" w:hAnsi="Cambria"/>
+          <w:i w:val="false"/>
+          <w:iCs w:val="false"/>
+          <w:sz w:val="24"/>
+          <w:szCs w:val="24"/>
+        </w:rPr>
+        <w:t xml:space="preserve">.</w:t>
+      </w:r>
+    </w:p>
+    <w:p>
+      <w:pPr>
+        <w:spacing w:after="260" w:line="360" w:lineRule="auto"/>
+        <w:jc w:val="left"/>
+      </w:pPr>
+      <w:r>
+        <w:rPr>
+          <w:rFonts w:ascii="Cambria" w:cs="Cambria" w:eastAsia="Cambria" w:hAnsi="Cambria"/>
+          <w:b/>
+          <w:bCs/>
+          <w:sz w:val="24"/>
+          <w:szCs w:val="24"/>
+        </w:rPr>
+        <w:t xml:space="preserve">Crossing.</w:t>
+      </w:r>
+      <w:r>
+        <w:rPr>
+          <w:rFonts w:ascii="Cambria" w:cs="Cambria" w:eastAsia="Cambria" w:hAnsi="Cambria"/>
+          <w:i w:val="false"/>
+          <w:iCs w:val="false"/>
+          <w:sz w:val="24"/>
+          <w:szCs w:val="24"/>
+        </w:rPr>
+        <w:t xml:space="preserve"> Reading an outgoing positron as an incoming electron with time reversed on the diagram, so one calculation covers several related processes. </w:t>
+      </w:r>
+      <w:r>
+        <w:rPr>
+          <w:rFonts w:ascii="Cambria" w:cs="Cambria" w:eastAsia="Cambria" w:hAnsi="Cambria"/>
+          <w:i w:val="false"/>
+          <w:iCs w:val="false"/>
+          <w:sz w:val="24"/>
+          <w:szCs w:val="24"/>
+        </w:rPr>
+        <w:t xml:space="preserve">Chapter </w:t>
+      </w:r>
+      <w:hyperlink w:history="1" w:anchor="toc26">
+        <w:r>
+          <w:rPr>
+            <w:rFonts w:ascii="Cambria" w:cs="Cambria" w:eastAsia="Cambria" w:hAnsi="Cambria"/>
+            <w:i w:val="false"/>
+            <w:iCs w:val="false"/>
+            <w:color w:val="44546A"/>
+            <w:sz w:val="24"/>
+            <w:szCs w:val="24"/>
+            <w:u w:val="single"/>
+          </w:rPr>
+          <w:t xml:space="preserve">19</w:t>
+        </w:r>
+      </w:hyperlink>
+      <w:r>
+        <w:rPr>
+          <w:rFonts w:ascii="Cambria" w:cs="Cambria" w:eastAsia="Cambria" w:hAnsi="Cambria"/>
+          <w:i w:val="false"/>
+          <w:iCs w:val="false"/>
+          <w:sz w:val="24"/>
+          <w:szCs w:val="24"/>
+        </w:rPr>
+        <w:t xml:space="preserve">.</w:t>
+      </w:r>
+    </w:p>
+    <w:p>
+      <w:pPr>
+        <w:spacing w:after="260" w:line="360" w:lineRule="auto"/>
+        <w:jc w:val="left"/>
+      </w:pPr>
+      <w:r>
+        <w:rPr>
+          <w:rFonts w:ascii="Cambria" w:cs="Cambria" w:eastAsia="Cambria" w:hAnsi="Cambria"/>
+          <w:b/>
+          <w:bCs/>
+          <w:sz w:val="24"/>
+          <w:szCs w:val="24"/>
+        </w:rPr>
+        <w:t xml:space="preserve">Curvature.</w:t>
+      </w:r>
+      <w:r>
+        <w:rPr>
+          <w:rFonts w:ascii="Cambria" w:cs="Cambria" w:eastAsia="Cambria" w:hAnsi="Cambria"/>
+          <w:i w:val="false"/>
+          <w:iCs w:val="false"/>
+          <w:sz w:val="24"/>
+          <w:szCs w:val="24"/>
+        </w:rPr>
+        <w:t xml:space="preserve"> The failure of a phase comparison to come back independent of path. In this book, that failure is the electromagnetic field. </w:t>
+      </w:r>
+      <w:r>
+        <w:rPr>
+          <w:rFonts w:ascii="Cambria" w:cs="Cambria" w:eastAsia="Cambria" w:hAnsi="Cambria"/>
+          <w:i w:val="false"/>
+          <w:iCs w:val="false"/>
+          <w:sz w:val="24"/>
+          <w:szCs w:val="24"/>
+        </w:rPr>
+        <w:t xml:space="preserve">Chapters </w:t>
+      </w:r>
+      <w:hyperlink w:history="1" w:anchor="toc27">
+        <w:r>
+          <w:rPr>
+            <w:rFonts w:ascii="Cambria" w:cs="Cambria" w:eastAsia="Cambria" w:hAnsi="Cambria"/>
+            <w:i w:val="false"/>
+            <w:iCs w:val="false"/>
+            <w:color w:val="44546A"/>
+            <w:sz w:val="24"/>
+            <w:szCs w:val="24"/>
+            <w:u w:val="single"/>
+          </w:rPr>
+          <w:t xml:space="preserve">20</w:t>
+        </w:r>
+      </w:hyperlink>
+      <w:r>
+        <w:rPr>
+          <w:rFonts w:ascii="Cambria" w:cs="Cambria" w:eastAsia="Cambria" w:hAnsi="Cambria"/>
+          <w:i w:val="false"/>
+          <w:iCs w:val="false"/>
+          <w:sz w:val="24"/>
+          <w:szCs w:val="24"/>
+        </w:rPr>
+        <w:t xml:space="preserve"> and 47.</w:t>
+      </w:r>
+    </w:p>
+    <w:p>
+      <w:pPr>
+        <w:spacing w:after="260" w:line="360" w:lineRule="auto"/>
+        <w:jc w:val="left"/>
+      </w:pPr>
+      <w:r>
+        <w:rPr>
+          <w:rFonts w:ascii="Cambria" w:cs="Cambria" w:eastAsia="Cambria" w:hAnsi="Cambria"/>
+          <w:b/>
+          <w:bCs/>
+          <w:sz w:val="24"/>
+          <w:szCs w:val="24"/>
+        </w:rPr>
+        <w:t xml:space="preserve">Decoherence.</w:t>
+      </w:r>
+      <w:r>
+        <w:rPr>
+          <w:rFonts w:ascii="Cambria" w:cs="Cambria" w:eastAsia="Cambria" w:hAnsi="Cambria"/>
+          <w:i w:val="false"/>
+          <w:iCs w:val="false"/>
+          <w:sz w:val="24"/>
+          <w:szCs w:val="24"/>
+        </w:rPr>
+        <w:t xml:space="preserve"> Environmental entanglement that scrambles the phase relationships large-scale interference needs. </w:t>
+      </w:r>
+      <w:r>
+        <w:rPr>
+          <w:rFonts w:ascii="Cambria" w:cs="Cambria" w:eastAsia="Cambria" w:hAnsi="Cambria"/>
+          <w:i w:val="false"/>
+          <w:iCs w:val="false"/>
+          <w:sz w:val="24"/>
+          <w:szCs w:val="24"/>
+        </w:rPr>
+        <w:t xml:space="preserve">Chapter </w:t>
+      </w:r>
+      <w:hyperlink w:history="1" w:anchor="toc40">
+        <w:r>
+          <w:rPr>
+            <w:rFonts w:ascii="Cambria" w:cs="Cambria" w:eastAsia="Cambria" w:hAnsi="Cambria"/>
+            <w:i w:val="false"/>
+            <w:iCs w:val="false"/>
+            <w:color w:val="44546A"/>
+            <w:sz w:val="24"/>
+            <w:szCs w:val="24"/>
+            <w:u w:val="single"/>
+          </w:rPr>
+          <w:t xml:space="preserve">31</w:t>
+        </w:r>
+      </w:hyperlink>
+      <w:r>
+        <w:rPr>
+          <w:rFonts w:ascii="Cambria" w:cs="Cambria" w:eastAsia="Cambria" w:hAnsi="Cambria"/>
+          <w:i w:val="false"/>
+          <w:iCs w:val="false"/>
+          <w:sz w:val="24"/>
+          <w:szCs w:val="24"/>
+        </w:rPr>
+        <w:t xml:space="preserve">.</w:t>
+      </w:r>
+    </w:p>
+    <w:p>
+      <w:pPr>
+        <w:spacing w:after="260" w:line="360" w:lineRule="auto"/>
+        <w:jc w:val="left"/>
+      </w:pPr>
+      <w:r>
+        <w:rPr>
+          <w:rFonts w:ascii="Cambria" w:cs="Cambria" w:eastAsia="Cambria" w:hAnsi="Cambria"/>
+          <w:b/>
+          <w:bCs/>
+          <w:sz w:val="24"/>
+          <w:szCs w:val="24"/>
+        </w:rPr>
+        <w:t xml:space="preserve">Effective theory.</w:t>
+      </w:r>
+      <w:r>
+        <w:rPr>
+          <w:rFonts w:ascii="Cambria" w:cs="Cambria" w:eastAsia="Cambria" w:hAnsi="Cambria"/>
+          <w:i w:val="false"/>
+          <w:iCs w:val="false"/>
+          <w:sz w:val="24"/>
+          <w:szCs w:val="24"/>
+        </w:rPr>
+        <w:t xml:space="preserve"> A description that keeps the variables relevant at one scale and absorbs the rest into its parameters. </w:t>
+      </w:r>
+      <w:r>
+        <w:rPr>
+          <w:rFonts w:ascii="Cambria" w:cs="Cambria" w:eastAsia="Cambria" w:hAnsi="Cambria"/>
+          <w:i w:val="false"/>
+          <w:iCs w:val="false"/>
+          <w:sz w:val="24"/>
+          <w:szCs w:val="24"/>
+        </w:rPr>
+        <w:t xml:space="preserve">Chapters </w:t>
+      </w:r>
+      <w:hyperlink w:history="1" w:anchor="toc28">
+        <w:r>
+          <w:rPr>
+            <w:rFonts w:ascii="Cambria" w:cs="Cambria" w:eastAsia="Cambria" w:hAnsi="Cambria"/>
+            <w:i w:val="false"/>
+            <w:iCs w:val="false"/>
+            <w:color w:val="44546A"/>
+            <w:sz w:val="24"/>
+            <w:szCs w:val="24"/>
+            <w:u w:val="single"/>
+          </w:rPr>
+          <w:t xml:space="preserve">21</w:t>
+        </w:r>
+      </w:hyperlink>
+      <w:r>
+        <w:rPr>
+          <w:rFonts w:ascii="Cambria" w:cs="Cambria" w:eastAsia="Cambria" w:hAnsi="Cambria"/>
+          <w:i w:val="false"/>
+          <w:iCs w:val="false"/>
+          <w:sz w:val="24"/>
+          <w:szCs w:val="24"/>
+        </w:rPr>
+        <w:t xml:space="preserve"> and 38.</w:t>
+      </w:r>
+    </w:p>
+    <w:p>
+      <w:pPr>
+        <w:spacing w:after="260" w:line="360" w:lineRule="auto"/>
+        <w:jc w:val="left"/>
+      </w:pPr>
+      <w:r>
+        <w:rPr>
+          <w:rFonts w:ascii="Cambria" w:cs="Cambria" w:eastAsia="Cambria" w:hAnsi="Cambria"/>
+          <w:b/>
+          <w:bCs/>
+          <w:sz w:val="24"/>
+          <w:szCs w:val="24"/>
+        </w:rPr>
+        <w:t xml:space="preserve">Entanglement.</w:t>
+      </w:r>
+      <w:r>
+        <w:rPr>
+          <w:rFonts w:ascii="Cambria" w:cs="Cambria" w:eastAsia="Cambria" w:hAnsi="Cambria"/>
+          <w:i w:val="false"/>
+          <w:iCs w:val="false"/>
+          <w:sz w:val="24"/>
+          <w:szCs w:val="24"/>
+        </w:rPr>
+        <w:t xml:space="preserve"> One joint state of two systems that cannot be pulled apart into two independent states. </w:t>
+      </w:r>
+      <w:r>
+        <w:rPr>
+          <w:rFonts w:ascii="Cambria" w:cs="Cambria" w:eastAsia="Cambria" w:hAnsi="Cambria"/>
+          <w:i w:val="false"/>
+          <w:iCs w:val="false"/>
+          <w:sz w:val="24"/>
+          <w:szCs w:val="24"/>
+        </w:rPr>
+        <w:t xml:space="preserve">Chapter </w:t>
+      </w:r>
+      <w:hyperlink w:history="1" w:anchor="toc43">
+        <w:r>
+          <w:rPr>
+            <w:rFonts w:ascii="Cambria" w:cs="Cambria" w:eastAsia="Cambria" w:hAnsi="Cambria"/>
+            <w:i w:val="false"/>
+            <w:iCs w:val="false"/>
+            <w:color w:val="44546A"/>
+            <w:sz w:val="24"/>
+            <w:szCs w:val="24"/>
+            <w:u w:val="single"/>
+          </w:rPr>
+          <w:t xml:space="preserve">33</w:t>
+        </w:r>
+      </w:hyperlink>
+      <w:r>
+        <w:rPr>
+          <w:rFonts w:ascii="Cambria" w:cs="Cambria" w:eastAsia="Cambria" w:hAnsi="Cambria"/>
+          <w:i w:val="false"/>
+          <w:iCs w:val="false"/>
+          <w:sz w:val="24"/>
+          <w:szCs w:val="24"/>
+        </w:rPr>
+        <w:t xml:space="preserve">.</w:t>
+      </w:r>
+    </w:p>
+    <w:p>
+      <w:pPr>
+        <w:spacing w:after="260" w:line="360" w:lineRule="auto"/>
+        <w:jc w:val="left"/>
+      </w:pPr>
+      <w:r>
+        <w:rPr>
+          <w:rFonts w:ascii="Cambria" w:cs="Cambria" w:eastAsia="Cambria" w:hAnsi="Cambria"/>
+          <w:b/>
+          <w:bCs/>
+          <w:sz w:val="24"/>
+          <w:szCs w:val="24"/>
+        </w:rPr>
+        <w:t xml:space="preserve">Feynman diagram.</w:t>
+      </w:r>
+      <w:r>
+        <w:rPr>
+          <w:rFonts w:ascii="Cambria" w:cs="Cambria" w:eastAsia="Cambria" w:hAnsi="Cambria"/>
+          <w:i w:val="false"/>
+          <w:iCs w:val="false"/>
+          <w:sz w:val="24"/>
+          <w:szCs w:val="24"/>
+        </w:rPr>
+        <w:t xml:space="preserve"> A picture of one term in a perturbative amplitude. Not a photograph of a process. </w:t>
+      </w:r>
+      <w:r>
+        <w:rPr>
+          <w:rFonts w:ascii="Cambria" w:cs="Cambria" w:eastAsia="Cambria" w:hAnsi="Cambria"/>
+          <w:i w:val="false"/>
+          <w:iCs w:val="false"/>
+          <w:sz w:val="24"/>
+          <w:szCs w:val="24"/>
+        </w:rPr>
+        <w:t xml:space="preserve">Chapter </w:t>
+      </w:r>
+      <w:hyperlink w:history="1" w:anchor="toc37">
         <w:r>
           <w:rPr>
             <w:rFonts w:ascii="Cambria" w:cs="Cambria" w:eastAsia="Cambria" w:hAnsi="Cambria"/>
@@ -32347,366 +32743,6 @@
           <w:sz w:val="24"/>
           <w:szCs w:val="24"/>
         </w:rPr>
-        <w:t xml:space="preserve">Crossing.</w:t>
-      </w:r>
-      <w:r>
-        <w:rPr>
-          <w:rFonts w:ascii="Cambria" w:cs="Cambria" w:eastAsia="Cambria" w:hAnsi="Cambria"/>
-          <w:i w:val="false"/>
-          <w:iCs w:val="false"/>
-          <w:sz w:val="24"/>
-          <w:szCs w:val="24"/>
-        </w:rPr>
-        <w:t xml:space="preserve"> Reading an outgoing positron as an incoming electron with time reversed on the diagram, so one calculation covers several related processes. </w:t>
-      </w:r>
-      <w:r>
-        <w:rPr>
-          <w:rFonts w:ascii="Cambria" w:cs="Cambria" w:eastAsia="Cambria" w:hAnsi="Cambria"/>
-          <w:i w:val="false"/>
-          <w:iCs w:val="false"/>
-          <w:sz w:val="24"/>
-          <w:szCs w:val="24"/>
-        </w:rPr>
-        <w:t xml:space="preserve">Chapter </w:t>
-      </w:r>
-      <w:hyperlink w:history="1" w:anchor="toc26">
-        <w:r>
-          <w:rPr>
-            <w:rFonts w:ascii="Cambria" w:cs="Cambria" w:eastAsia="Cambria" w:hAnsi="Cambria"/>
-            <w:i w:val="false"/>
-            <w:iCs w:val="false"/>
-            <w:color w:val="44546A"/>
-            <w:sz w:val="24"/>
-            <w:szCs w:val="24"/>
-            <w:u w:val="single"/>
-          </w:rPr>
-          <w:t xml:space="preserve">20</w:t>
-        </w:r>
-      </w:hyperlink>
-      <w:r>
-        <w:rPr>
-          <w:rFonts w:ascii="Cambria" w:cs="Cambria" w:eastAsia="Cambria" w:hAnsi="Cambria"/>
-          <w:i w:val="false"/>
-          <w:iCs w:val="false"/>
-          <w:sz w:val="24"/>
-          <w:szCs w:val="24"/>
-        </w:rPr>
-        <w:t xml:space="preserve">.</w:t>
-      </w:r>
-    </w:p>
-    <w:p>
-      <w:pPr>
-        <w:spacing w:after="260" w:line="360" w:lineRule="auto"/>
-        <w:jc w:val="left"/>
-      </w:pPr>
-      <w:r>
-        <w:rPr>
-          <w:rFonts w:ascii="Cambria" w:cs="Cambria" w:eastAsia="Cambria" w:hAnsi="Cambria"/>
-          <w:b/>
-          <w:bCs/>
-          <w:sz w:val="24"/>
-          <w:szCs w:val="24"/>
-        </w:rPr>
-        <w:t xml:space="preserve">Curvature.</w:t>
-      </w:r>
-      <w:r>
-        <w:rPr>
-          <w:rFonts w:ascii="Cambria" w:cs="Cambria" w:eastAsia="Cambria" w:hAnsi="Cambria"/>
-          <w:i w:val="false"/>
-          <w:iCs w:val="false"/>
-          <w:sz w:val="24"/>
-          <w:szCs w:val="24"/>
-        </w:rPr>
-        <w:t xml:space="preserve"> The failure of a phase comparison to come back independent of path. In this book, that failure is the electromagnetic field. </w:t>
-      </w:r>
-      <w:r>
-        <w:rPr>
-          <w:rFonts w:ascii="Cambria" w:cs="Cambria" w:eastAsia="Cambria" w:hAnsi="Cambria"/>
-          <w:i w:val="false"/>
-          <w:iCs w:val="false"/>
-          <w:sz w:val="24"/>
-          <w:szCs w:val="24"/>
-        </w:rPr>
-        <w:t xml:space="preserve">Chapters </w:t>
-      </w:r>
-      <w:hyperlink w:history="1" w:anchor="toc27">
-        <w:r>
-          <w:rPr>
-            <w:rFonts w:ascii="Cambria" w:cs="Cambria" w:eastAsia="Cambria" w:hAnsi="Cambria"/>
-            <w:i w:val="false"/>
-            <w:iCs w:val="false"/>
-            <w:color w:val="44546A"/>
-            <w:sz w:val="24"/>
-            <w:szCs w:val="24"/>
-            <w:u w:val="single"/>
-          </w:rPr>
-          <w:t xml:space="preserve">21</w:t>
-        </w:r>
-      </w:hyperlink>
-      <w:r>
-        <w:rPr>
-          <w:rFonts w:ascii="Cambria" w:cs="Cambria" w:eastAsia="Cambria" w:hAnsi="Cambria"/>
-          <w:i w:val="false"/>
-          <w:iCs w:val="false"/>
-          <w:sz w:val="24"/>
-          <w:szCs w:val="24"/>
-        </w:rPr>
-        <w:t xml:space="preserve"> and 48.</w:t>
-      </w:r>
-    </w:p>
-    <w:p>
-      <w:pPr>
-        <w:spacing w:after="260" w:line="360" w:lineRule="auto"/>
-        <w:jc w:val="left"/>
-      </w:pPr>
-      <w:r>
-        <w:rPr>
-          <w:rFonts w:ascii="Cambria" w:cs="Cambria" w:eastAsia="Cambria" w:hAnsi="Cambria"/>
-          <w:b/>
-          <w:bCs/>
-          <w:sz w:val="24"/>
-          <w:szCs w:val="24"/>
-        </w:rPr>
-        <w:t xml:space="preserve">Decoherence.</w:t>
-      </w:r>
-      <w:r>
-        <w:rPr>
-          <w:rFonts w:ascii="Cambria" w:cs="Cambria" w:eastAsia="Cambria" w:hAnsi="Cambria"/>
-          <w:i w:val="false"/>
-          <w:iCs w:val="false"/>
-          <w:sz w:val="24"/>
-          <w:szCs w:val="24"/>
-        </w:rPr>
-        <w:t xml:space="preserve"> Environmental entanglement that scrambles the phase relationships large-scale interference needs. </w:t>
-      </w:r>
-      <w:r>
-        <w:rPr>
-          <w:rFonts w:ascii="Cambria" w:cs="Cambria" w:eastAsia="Cambria" w:hAnsi="Cambria"/>
-          <w:i w:val="false"/>
-          <w:iCs w:val="false"/>
-          <w:sz w:val="24"/>
-          <w:szCs w:val="24"/>
-        </w:rPr>
-        <w:t xml:space="preserve">Chapter </w:t>
-      </w:r>
-      <w:hyperlink w:history="1" w:anchor="toc40">
-        <w:r>
-          <w:rPr>
-            <w:rFonts w:ascii="Cambria" w:cs="Cambria" w:eastAsia="Cambria" w:hAnsi="Cambria"/>
-            <w:i w:val="false"/>
-            <w:iCs w:val="false"/>
-            <w:color w:val="44546A"/>
-            <w:sz w:val="24"/>
-            <w:szCs w:val="24"/>
-            <w:u w:val="single"/>
-          </w:rPr>
-          <w:t xml:space="preserve">32</w:t>
-        </w:r>
-      </w:hyperlink>
-      <w:r>
-        <w:rPr>
-          <w:rFonts w:ascii="Cambria" w:cs="Cambria" w:eastAsia="Cambria" w:hAnsi="Cambria"/>
-          <w:i w:val="false"/>
-          <w:iCs w:val="false"/>
-          <w:sz w:val="24"/>
-          <w:szCs w:val="24"/>
-        </w:rPr>
-        <w:t xml:space="preserve">.</w:t>
-      </w:r>
-    </w:p>
-    <w:p>
-      <w:pPr>
-        <w:spacing w:after="260" w:line="360" w:lineRule="auto"/>
-        <w:jc w:val="left"/>
-      </w:pPr>
-      <w:r>
-        <w:rPr>
-          <w:rFonts w:ascii="Cambria" w:cs="Cambria" w:eastAsia="Cambria" w:hAnsi="Cambria"/>
-          <w:b/>
-          <w:bCs/>
-          <w:sz w:val="24"/>
-          <w:szCs w:val="24"/>
-        </w:rPr>
-        <w:t xml:space="preserve">Effective theory.</w:t>
-      </w:r>
-      <w:r>
-        <w:rPr>
-          <w:rFonts w:ascii="Cambria" w:cs="Cambria" w:eastAsia="Cambria" w:hAnsi="Cambria"/>
-          <w:i w:val="false"/>
-          <w:iCs w:val="false"/>
-          <w:sz w:val="24"/>
-          <w:szCs w:val="24"/>
-        </w:rPr>
-        <w:t xml:space="preserve"> A description that keeps the variables relevant at one scale and absorbs the rest into its parameters. </w:t>
-      </w:r>
-      <w:r>
-        <w:rPr>
-          <w:rFonts w:ascii="Cambria" w:cs="Cambria" w:eastAsia="Cambria" w:hAnsi="Cambria"/>
-          <w:i w:val="false"/>
-          <w:iCs w:val="false"/>
-          <w:sz w:val="24"/>
-          <w:szCs w:val="24"/>
-        </w:rPr>
-        <w:t xml:space="preserve">Chapters </w:t>
-      </w:r>
-      <w:hyperlink w:history="1" w:anchor="toc28">
-        <w:r>
-          <w:rPr>
-            <w:rFonts w:ascii="Cambria" w:cs="Cambria" w:eastAsia="Cambria" w:hAnsi="Cambria"/>
-            <w:i w:val="false"/>
-            <w:iCs w:val="false"/>
-            <w:color w:val="44546A"/>
-            <w:sz w:val="24"/>
-            <w:szCs w:val="24"/>
-            <w:u w:val="single"/>
-          </w:rPr>
-          <w:t xml:space="preserve">22</w:t>
-        </w:r>
-      </w:hyperlink>
-      <w:r>
-        <w:rPr>
-          <w:rFonts w:ascii="Cambria" w:cs="Cambria" w:eastAsia="Cambria" w:hAnsi="Cambria"/>
-          <w:i w:val="false"/>
-          <w:iCs w:val="false"/>
-          <w:sz w:val="24"/>
-          <w:szCs w:val="24"/>
-        </w:rPr>
-        <w:t xml:space="preserve"> and 39.</w:t>
-      </w:r>
-    </w:p>
-    <w:p>
-      <w:pPr>
-        <w:spacing w:after="260" w:line="360" w:lineRule="auto"/>
-        <w:jc w:val="left"/>
-      </w:pPr>
-      <w:r>
-        <w:rPr>
-          <w:rFonts w:ascii="Cambria" w:cs="Cambria" w:eastAsia="Cambria" w:hAnsi="Cambria"/>
-          <w:b/>
-          <w:bCs/>
-          <w:sz w:val="24"/>
-          <w:szCs w:val="24"/>
-        </w:rPr>
-        <w:t xml:space="preserve">Entanglement.</w:t>
-      </w:r>
-      <w:r>
-        <w:rPr>
-          <w:rFonts w:ascii="Cambria" w:cs="Cambria" w:eastAsia="Cambria" w:hAnsi="Cambria"/>
-          <w:i w:val="false"/>
-          <w:iCs w:val="false"/>
-          <w:sz w:val="24"/>
-          <w:szCs w:val="24"/>
-        </w:rPr>
-        <w:t xml:space="preserve"> One joint state of two systems that cannot be pulled apart into two independent states. </w:t>
-      </w:r>
-      <w:r>
-        <w:rPr>
-          <w:rFonts w:ascii="Cambria" w:cs="Cambria" w:eastAsia="Cambria" w:hAnsi="Cambria"/>
-          <w:i w:val="false"/>
-          <w:iCs w:val="false"/>
-          <w:sz w:val="24"/>
-          <w:szCs w:val="24"/>
-        </w:rPr>
-        <w:t xml:space="preserve">Chapter </w:t>
-      </w:r>
-      <w:hyperlink w:history="1" w:anchor="toc43">
-        <w:r>
-          <w:rPr>
-            <w:rFonts w:ascii="Cambria" w:cs="Cambria" w:eastAsia="Cambria" w:hAnsi="Cambria"/>
-            <w:i w:val="false"/>
-            <w:iCs w:val="false"/>
-            <w:color w:val="44546A"/>
-            <w:sz w:val="24"/>
-            <w:szCs w:val="24"/>
-            <w:u w:val="single"/>
-          </w:rPr>
-          <w:t xml:space="preserve">34</w:t>
-        </w:r>
-      </w:hyperlink>
-      <w:r>
-        <w:rPr>
-          <w:rFonts w:ascii="Cambria" w:cs="Cambria" w:eastAsia="Cambria" w:hAnsi="Cambria"/>
-          <w:i w:val="false"/>
-          <w:iCs w:val="false"/>
-          <w:sz w:val="24"/>
-          <w:szCs w:val="24"/>
-        </w:rPr>
-        <w:t xml:space="preserve">.</w:t>
-      </w:r>
-    </w:p>
-    <w:p>
-      <w:pPr>
-        <w:spacing w:after="260" w:line="360" w:lineRule="auto"/>
-        <w:jc w:val="left"/>
-      </w:pPr>
-      <w:r>
-        <w:rPr>
-          <w:rFonts w:ascii="Cambria" w:cs="Cambria" w:eastAsia="Cambria" w:hAnsi="Cambria"/>
-          <w:b/>
-          <w:bCs/>
-          <w:sz w:val="24"/>
-          <w:szCs w:val="24"/>
-        </w:rPr>
-        <w:t xml:space="preserve">Feynman diagram.</w:t>
-      </w:r>
-      <w:r>
-        <w:rPr>
-          <w:rFonts w:ascii="Cambria" w:cs="Cambria" w:eastAsia="Cambria" w:hAnsi="Cambria"/>
-          <w:i w:val="false"/>
-          <w:iCs w:val="false"/>
-          <w:sz w:val="24"/>
-          <w:szCs w:val="24"/>
-        </w:rPr>
-        <w:t xml:space="preserve"> A picture of one term in a perturbative amplitude. Not a photograph of a process. </w:t>
-      </w:r>
-      <w:r>
-        <w:rPr>
-          <w:rFonts w:ascii="Cambria" w:cs="Cambria" w:eastAsia="Cambria" w:hAnsi="Cambria"/>
-          <w:i w:val="false"/>
-          <w:iCs w:val="false"/>
-          <w:sz w:val="24"/>
-          <w:szCs w:val="24"/>
-        </w:rPr>
-        <w:t xml:space="preserve">Chapter </w:t>
-      </w:r>
-      <w:hyperlink w:history="1" w:anchor="toc37">
-        <w:r>
-          <w:rPr>
-            <w:rFonts w:ascii="Cambria" w:cs="Cambria" w:eastAsia="Cambria" w:hAnsi="Cambria"/>
-            <w:i w:val="false"/>
-            <w:iCs w:val="false"/>
-            <w:color w:val="44546A"/>
-            <w:sz w:val="24"/>
-            <w:szCs w:val="24"/>
-            <w:u w:val="single"/>
-          </w:rPr>
-          <w:t xml:space="preserve">29</w:t>
-        </w:r>
-      </w:hyperlink>
-      <w:r>
-        <w:rPr>
-          <w:rFonts w:ascii="Cambria" w:cs="Cambria" w:eastAsia="Cambria" w:hAnsi="Cambria"/>
-          <w:i w:val="false"/>
-          <w:iCs w:val="false"/>
-          <w:sz w:val="24"/>
-          <w:szCs w:val="24"/>
-        </w:rPr>
-        <w:t xml:space="preserve">.</w:t>
-      </w:r>
-    </w:p>
-    <w:p>
-      <w:pPr>
-        <w:spacing w:after="260" w:line="360" w:lineRule="auto"/>
-        <w:jc w:val="left"/>
-      </w:pPr>
-      <w:r>
-        <w:rPr>
-          <w:rFonts w:ascii="Cambria" w:cs="Cambria" w:eastAsia="Cambria" w:hAnsi="Cambria"/>
-          <w:b/>
-          <w:bCs/>
-          <w:sz w:val="24"/>
-          <w:szCs w:val="24"/>
-        </w:rPr>
         <w:t xml:space="preserve">Fine-structure constant.</w:t>
       </w:r>
       <w:r>
@@ -32760,7 +32796,7 @@
             <w:szCs w:val="24"/>
             <w:u w:val="single"/>
           </w:rPr>
-          <w:t xml:space="preserve">38</w:t>
+          <w:t xml:space="preserve">37</w:t>
         </w:r>
       </w:hyperlink>
       <w:r>
@@ -33200,7 +33236,7 @@
             <w:szCs w:val="24"/>
             <w:u w:val="single"/>
           </w:rPr>
-          <w:t xml:space="preserve">40</w:t>
+          <w:t xml:space="preserve">39</w:t>
         </w:r>
       </w:hyperlink>
       <w:r>
@@ -33250,242 +33286,6 @@
         <w:t xml:space="preserve">Chapter </w:t>
       </w:r>
       <w:hyperlink w:history="1" w:anchor="toc36">
-        <w:r>
-          <w:rPr>
-            <w:rFonts w:ascii="Cambria" w:cs="Cambria" w:eastAsia="Cambria" w:hAnsi="Cambria"/>
-            <w:i w:val="false"/>
-            <w:iCs w:val="false"/>
-            <w:color w:val="44546A"/>
-            <w:sz w:val="24"/>
-            <w:szCs w:val="24"/>
-            <w:u w:val="single"/>
-          </w:rPr>
-          <w:t xml:space="preserve">28</w:t>
-        </w:r>
-      </w:hyperlink>
-      <w:r>
-        <w:rPr>
-          <w:rFonts w:ascii="Cambria" w:cs="Cambria" w:eastAsia="Cambria" w:hAnsi="Cambria"/>
-          <w:i w:val="false"/>
-          <w:iCs w:val="false"/>
-          <w:sz w:val="24"/>
-          <w:szCs w:val="24"/>
-        </w:rPr>
-        <w:t xml:space="preserve"> the interaction term is the one the substitution checks. The field term beside it, −(1/4μ₀)</w:t>
-      </w:r>
-      <w:r>
-        <w:rPr>
-          <w:rFonts w:ascii="Cambria Math" w:cs="Cambria Math" w:eastAsia="Cambria Math" w:hAnsi="Cambria Math"/>
-          <w:i/>
-          <w:iCs/>
-          <w:sz w:val="24"/>
-          <w:szCs w:val="24"/>
-        </w:rPr>
-        <w:t xml:space="preserve">F</w:t>
-      </w:r>
-      <w:r>
-        <w:rPr>
-          <w:rFonts w:ascii="Cambria Math" w:cs="Cambria Math" w:eastAsia="Cambria Math" w:hAnsi="Cambria Math"/>
-          <w:i/>
-          <w:iCs/>
-          <w:sz w:val="24"/>
-          <w:szCs w:val="24"/>
-          <w:vertAlign w:val="subscript"/>
-        </w:rPr>
-        <w:t xml:space="preserve">uvF</w:t>
-      </w:r>
-      <w:r>
-        <w:rPr>
-          <w:rFonts w:ascii="Cambria Math" w:cs="Cambria Math" w:eastAsia="Cambria Math" w:hAnsi="Cambria Math"/>
-          <w:i/>
-          <w:iCs/>
-          <w:sz w:val="24"/>
-          <w:szCs w:val="24"/>
-          <w:vertAlign w:val="superscript"/>
-        </w:rPr>
-        <w:t xml:space="preserve">uv</w:t>
-      </w:r>
-      <w:r>
-        <w:rPr>
-          <w:rFonts w:ascii="Cambria" w:cs="Cambria" w:eastAsia="Cambria" w:hAnsi="Cambria"/>
-          <w:i w:val="false"/>
-          <w:iCs w:val="false"/>
-          <w:sz w:val="24"/>
-          <w:szCs w:val="24"/>
-        </w:rPr>
-        <w:t xml:space="preserve">, is the standard SI density for the free electromagnetic field, left unexpanded into </w:t>
-      </w:r>
-      <w:r>
-        <w:rPr>
-          <w:rFonts w:ascii="Cambria" w:cs="Cambria" w:eastAsia="Cambria" w:hAnsi="Cambria"/>
-          <w:b/>
-          <w:bCs/>
-          <w:sz w:val="24"/>
-          <w:szCs w:val="24"/>
-        </w:rPr>
-        <w:t xml:space="preserve">E</w:t>
-      </w:r>
-      <w:r>
-        <w:rPr>
-          <w:rFonts w:ascii="Cambria" w:cs="Cambria" w:eastAsia="Cambria" w:hAnsi="Cambria"/>
-          <w:i w:val="false"/>
-          <w:iCs w:val="false"/>
-          <w:sz w:val="24"/>
-          <w:szCs w:val="24"/>
-        </w:rPr>
-        <w:t xml:space="preserve"> and </w:t>
-      </w:r>
-      <w:r>
-        <w:rPr>
-          <w:rFonts w:ascii="Cambria" w:cs="Cambria" w:eastAsia="Cambria" w:hAnsi="Cambria"/>
-          <w:b/>
-          <w:bCs/>
-          <w:sz w:val="24"/>
-          <w:szCs w:val="24"/>
-        </w:rPr>
-        <w:t xml:space="preserve">B</w:t>
-      </w:r>
-      <w:r>
-        <w:rPr>
-          <w:rFonts w:ascii="Cambria" w:cs="Cambria" w:eastAsia="Cambria" w:hAnsi="Cambria"/>
-          <w:i w:val="false"/>
-          <w:iCs w:val="false"/>
-          <w:sz w:val="24"/>
-          <w:szCs w:val="24"/>
-        </w:rPr>
-        <w:t xml:space="preserve">. </w:t>
-      </w:r>
-      <w:r>
-        <w:rPr>
-          <w:rFonts w:ascii="Cambria" w:cs="Cambria" w:eastAsia="Cambria" w:hAnsi="Cambria"/>
-          <w:i w:val="false"/>
-          <w:iCs w:val="false"/>
-          <w:sz w:val="24"/>
-          <w:szCs w:val="24"/>
-        </w:rPr>
-        <w:t xml:space="preserve">Chapter </w:t>
-      </w:r>
-      <w:hyperlink w:history="1" w:anchor="toc36">
-        <w:r>
-          <w:rPr>
-            <w:rFonts w:ascii="Cambria" w:cs="Cambria" w:eastAsia="Cambria" w:hAnsi="Cambria"/>
-            <w:i w:val="false"/>
-            <w:iCs w:val="false"/>
-            <w:color w:val="44546A"/>
-            <w:sz w:val="24"/>
-            <w:szCs w:val="24"/>
-            <w:u w:val="single"/>
-          </w:rPr>
-          <w:t xml:space="preserve">28</w:t>
-        </w:r>
-      </w:hyperlink>
-      <w:r>
-        <w:rPr>
-          <w:rFonts w:ascii="Cambria" w:cs="Cambria" w:eastAsia="Cambria" w:hAnsi="Cambria"/>
-          <w:i w:val="false"/>
-          <w:iCs w:val="false"/>
-          <w:sz w:val="24"/>
-          <w:szCs w:val="24"/>
-        </w:rPr>
-        <w:t xml:space="preserve">.</w:t>
-      </w:r>
-    </w:p>
-    <w:p>
-      <w:pPr>
-        <w:spacing w:after="260" w:line="360" w:lineRule="auto"/>
-        <w:jc w:val="left"/>
-      </w:pPr>
-      <w:r>
-        <w:rPr>
-          <w:rFonts w:ascii="Cambria" w:cs="Cambria" w:eastAsia="Cambria" w:hAnsi="Cambria"/>
-          <w:b/>
-          <w:bCs/>
-          <w:sz w:val="24"/>
-          <w:szCs w:val="24"/>
-        </w:rPr>
-        <w:t xml:space="preserve">Lamb shift.</w:t>
-      </w:r>
-      <w:r>
-        <w:rPr>
-          <w:rFonts w:ascii="Cambria" w:cs="Cambria" w:eastAsia="Cambria" w:hAnsi="Cambria"/>
-          <w:i w:val="false"/>
-          <w:iCs w:val="false"/>
-          <w:sz w:val="24"/>
-          <w:szCs w:val="24"/>
-        </w:rPr>
-        <w:t xml:space="preserve"> The splitting, about 1058 megahertz, between the hydrogen 2S and 2P levels. </w:t>
-      </w:r>
-      <w:r>
-        <w:rPr>
-          <w:rFonts w:ascii="Cambria" w:cs="Cambria" w:eastAsia="Cambria" w:hAnsi="Cambria"/>
-          <w:i w:val="false"/>
-          <w:iCs w:val="false"/>
-          <w:sz w:val="24"/>
-          <w:szCs w:val="24"/>
-        </w:rPr>
-        <w:t xml:space="preserve">Chapter </w:t>
-      </w:r>
-      <w:hyperlink w:history="1" w:anchor="toc26">
-        <w:r>
-          <w:rPr>
-            <w:rFonts w:ascii="Cambria" w:cs="Cambria" w:eastAsia="Cambria" w:hAnsi="Cambria"/>
-            <w:i w:val="false"/>
-            <w:iCs w:val="false"/>
-            <w:color w:val="44546A"/>
-            <w:sz w:val="24"/>
-            <w:szCs w:val="24"/>
-            <w:u w:val="single"/>
-          </w:rPr>
-          <w:t xml:space="preserve">20</w:t>
-        </w:r>
-      </w:hyperlink>
-      <w:r>
-        <w:rPr>
-          <w:rFonts w:ascii="Cambria" w:cs="Cambria" w:eastAsia="Cambria" w:hAnsi="Cambria"/>
-          <w:i w:val="false"/>
-          <w:iCs w:val="false"/>
-          <w:sz w:val="24"/>
-          <w:szCs w:val="24"/>
-        </w:rPr>
-        <w:t xml:space="preserve">.</w:t>
-      </w:r>
-    </w:p>
-    <w:p>
-      <w:pPr>
-        <w:spacing w:after="260" w:line="360" w:lineRule="auto"/>
-        <w:jc w:val="left"/>
-      </w:pPr>
-      <w:r>
-        <w:rPr>
-          <w:rFonts w:ascii="Cambria" w:cs="Cambria" w:eastAsia="Cambria" w:hAnsi="Cambria"/>
-          <w:b/>
-          <w:bCs/>
-          <w:sz w:val="24"/>
-          <w:szCs w:val="24"/>
-        </w:rPr>
-        <w:t xml:space="preserve">Magnetic monopole.</w:t>
-      </w:r>
-      <w:r>
-        <w:rPr>
-          <w:rFonts w:ascii="Cambria" w:cs="Cambria" w:eastAsia="Cambria" w:hAnsi="Cambria"/>
-          <w:i w:val="false"/>
-          <w:iCs w:val="false"/>
-          <w:sz w:val="24"/>
-          <w:szCs w:val="24"/>
-        </w:rPr>
-        <w:t xml:space="preserve"> An isolated magnetic charge. None has been detected. Dirac showed that one, anywhere, would force electric charge to come in steps. </w:t>
-      </w:r>
-      <w:r>
-        <w:rPr>
-          <w:rFonts w:ascii="Cambria" w:cs="Cambria" w:eastAsia="Cambria" w:hAnsi="Cambria"/>
-          <w:i w:val="false"/>
-          <w:iCs w:val="false"/>
-          <w:sz w:val="24"/>
-          <w:szCs w:val="24"/>
-        </w:rPr>
-        <w:t xml:space="preserve">Chapter </w:t>
-      </w:r>
-      <w:hyperlink w:history="1" w:anchor="toc34">
         <w:r>
           <w:rPr>
             <w:rFonts w:ascii="Cambria" w:cs="Cambria" w:eastAsia="Cambria" w:hAnsi="Cambria"/>
@@ -33507,6 +33307,242 @@
           <w:sz w:val="24"/>
           <w:szCs w:val="24"/>
         </w:rPr>
+        <w:t xml:space="preserve"> the interaction term is the one the substitution checks. The field term beside it, −(1/4μ₀)</w:t>
+      </w:r>
+      <w:r>
+        <w:rPr>
+          <w:rFonts w:ascii="Cambria Math" w:cs="Cambria Math" w:eastAsia="Cambria Math" w:hAnsi="Cambria Math"/>
+          <w:i/>
+          <w:iCs/>
+          <w:sz w:val="24"/>
+          <w:szCs w:val="24"/>
+        </w:rPr>
+        <w:t xml:space="preserve">F</w:t>
+      </w:r>
+      <w:r>
+        <w:rPr>
+          <w:rFonts w:ascii="Cambria Math" w:cs="Cambria Math" w:eastAsia="Cambria Math" w:hAnsi="Cambria Math"/>
+          <w:i/>
+          <w:iCs/>
+          <w:sz w:val="24"/>
+          <w:szCs w:val="24"/>
+          <w:vertAlign w:val="subscript"/>
+        </w:rPr>
+        <w:t xml:space="preserve">uvF</w:t>
+      </w:r>
+      <w:r>
+        <w:rPr>
+          <w:rFonts w:ascii="Cambria Math" w:cs="Cambria Math" w:eastAsia="Cambria Math" w:hAnsi="Cambria Math"/>
+          <w:i/>
+          <w:iCs/>
+          <w:sz w:val="24"/>
+          <w:szCs w:val="24"/>
+          <w:vertAlign w:val="superscript"/>
+        </w:rPr>
+        <w:t xml:space="preserve">uv</w:t>
+      </w:r>
+      <w:r>
+        <w:rPr>
+          <w:rFonts w:ascii="Cambria" w:cs="Cambria" w:eastAsia="Cambria" w:hAnsi="Cambria"/>
+          <w:i w:val="false"/>
+          <w:iCs w:val="false"/>
+          <w:sz w:val="24"/>
+          <w:szCs w:val="24"/>
+        </w:rPr>
+        <w:t xml:space="preserve">, is the standard SI density for the free electromagnetic field, left unexpanded into </w:t>
+      </w:r>
+      <w:r>
+        <w:rPr>
+          <w:rFonts w:ascii="Cambria" w:cs="Cambria" w:eastAsia="Cambria" w:hAnsi="Cambria"/>
+          <w:b/>
+          <w:bCs/>
+          <w:sz w:val="24"/>
+          <w:szCs w:val="24"/>
+        </w:rPr>
+        <w:t xml:space="preserve">E</w:t>
+      </w:r>
+      <w:r>
+        <w:rPr>
+          <w:rFonts w:ascii="Cambria" w:cs="Cambria" w:eastAsia="Cambria" w:hAnsi="Cambria"/>
+          <w:i w:val="false"/>
+          <w:iCs w:val="false"/>
+          <w:sz w:val="24"/>
+          <w:szCs w:val="24"/>
+        </w:rPr>
+        <w:t xml:space="preserve"> and </w:t>
+      </w:r>
+      <w:r>
+        <w:rPr>
+          <w:rFonts w:ascii="Cambria" w:cs="Cambria" w:eastAsia="Cambria" w:hAnsi="Cambria"/>
+          <w:b/>
+          <w:bCs/>
+          <w:sz w:val="24"/>
+          <w:szCs w:val="24"/>
+        </w:rPr>
+        <w:t xml:space="preserve">B</w:t>
+      </w:r>
+      <w:r>
+        <w:rPr>
+          <w:rFonts w:ascii="Cambria" w:cs="Cambria" w:eastAsia="Cambria" w:hAnsi="Cambria"/>
+          <w:i w:val="false"/>
+          <w:iCs w:val="false"/>
+          <w:sz w:val="24"/>
+          <w:szCs w:val="24"/>
+        </w:rPr>
+        <w:t xml:space="preserve">. </w:t>
+      </w:r>
+      <w:r>
+        <w:rPr>
+          <w:rFonts w:ascii="Cambria" w:cs="Cambria" w:eastAsia="Cambria" w:hAnsi="Cambria"/>
+          <w:i w:val="false"/>
+          <w:iCs w:val="false"/>
+          <w:sz w:val="24"/>
+          <w:szCs w:val="24"/>
+        </w:rPr>
+        <w:t xml:space="preserve">Chapter </w:t>
+      </w:r>
+      <w:hyperlink w:history="1" w:anchor="toc36">
+        <w:r>
+          <w:rPr>
+            <w:rFonts w:ascii="Cambria" w:cs="Cambria" w:eastAsia="Cambria" w:hAnsi="Cambria"/>
+            <w:i w:val="false"/>
+            <w:iCs w:val="false"/>
+            <w:color w:val="44546A"/>
+            <w:sz w:val="24"/>
+            <w:szCs w:val="24"/>
+            <w:u w:val="single"/>
+          </w:rPr>
+          <w:t xml:space="preserve">27</w:t>
+        </w:r>
+      </w:hyperlink>
+      <w:r>
+        <w:rPr>
+          <w:rFonts w:ascii="Cambria" w:cs="Cambria" w:eastAsia="Cambria" w:hAnsi="Cambria"/>
+          <w:i w:val="false"/>
+          <w:iCs w:val="false"/>
+          <w:sz w:val="24"/>
+          <w:szCs w:val="24"/>
+        </w:rPr>
+        <w:t xml:space="preserve">.</w:t>
+      </w:r>
+    </w:p>
+    <w:p>
+      <w:pPr>
+        <w:spacing w:after="260" w:line="360" w:lineRule="auto"/>
+        <w:jc w:val="left"/>
+      </w:pPr>
+      <w:r>
+        <w:rPr>
+          <w:rFonts w:ascii="Cambria" w:cs="Cambria" w:eastAsia="Cambria" w:hAnsi="Cambria"/>
+          <w:b/>
+          <w:bCs/>
+          <w:sz w:val="24"/>
+          <w:szCs w:val="24"/>
+        </w:rPr>
+        <w:t xml:space="preserve">Lamb shift.</w:t>
+      </w:r>
+      <w:r>
+        <w:rPr>
+          <w:rFonts w:ascii="Cambria" w:cs="Cambria" w:eastAsia="Cambria" w:hAnsi="Cambria"/>
+          <w:i w:val="false"/>
+          <w:iCs w:val="false"/>
+          <w:sz w:val="24"/>
+          <w:szCs w:val="24"/>
+        </w:rPr>
+        <w:t xml:space="preserve"> The splitting, about 1058 megahertz, between the hydrogen 2S and 2P levels. </w:t>
+      </w:r>
+      <w:r>
+        <w:rPr>
+          <w:rFonts w:ascii="Cambria" w:cs="Cambria" w:eastAsia="Cambria" w:hAnsi="Cambria"/>
+          <w:i w:val="false"/>
+          <w:iCs w:val="false"/>
+          <w:sz w:val="24"/>
+          <w:szCs w:val="24"/>
+        </w:rPr>
+        <w:t xml:space="preserve">Chapter </w:t>
+      </w:r>
+      <w:hyperlink w:history="1" w:anchor="toc26">
+        <w:r>
+          <w:rPr>
+            <w:rFonts w:ascii="Cambria" w:cs="Cambria" w:eastAsia="Cambria" w:hAnsi="Cambria"/>
+            <w:i w:val="false"/>
+            <w:iCs w:val="false"/>
+            <w:color w:val="44546A"/>
+            <w:sz w:val="24"/>
+            <w:szCs w:val="24"/>
+            <w:u w:val="single"/>
+          </w:rPr>
+          <w:t xml:space="preserve">19</w:t>
+        </w:r>
+      </w:hyperlink>
+      <w:r>
+        <w:rPr>
+          <w:rFonts w:ascii="Cambria" w:cs="Cambria" w:eastAsia="Cambria" w:hAnsi="Cambria"/>
+          <w:i w:val="false"/>
+          <w:iCs w:val="false"/>
+          <w:sz w:val="24"/>
+          <w:szCs w:val="24"/>
+        </w:rPr>
+        <w:t xml:space="preserve">.</w:t>
+      </w:r>
+    </w:p>
+    <w:p>
+      <w:pPr>
+        <w:spacing w:after="260" w:line="360" w:lineRule="auto"/>
+        <w:jc w:val="left"/>
+      </w:pPr>
+      <w:r>
+        <w:rPr>
+          <w:rFonts w:ascii="Cambria" w:cs="Cambria" w:eastAsia="Cambria" w:hAnsi="Cambria"/>
+          <w:b/>
+          <w:bCs/>
+          <w:sz w:val="24"/>
+          <w:szCs w:val="24"/>
+        </w:rPr>
+        <w:t xml:space="preserve">Magnetic monopole.</w:t>
+      </w:r>
+      <w:r>
+        <w:rPr>
+          <w:rFonts w:ascii="Cambria" w:cs="Cambria" w:eastAsia="Cambria" w:hAnsi="Cambria"/>
+          <w:i w:val="false"/>
+          <w:iCs w:val="false"/>
+          <w:sz w:val="24"/>
+          <w:szCs w:val="24"/>
+        </w:rPr>
+        <w:t xml:space="preserve"> An isolated magnetic charge. None has been detected. Dirac showed that one, anywhere, would force electric charge to come in steps. </w:t>
+      </w:r>
+      <w:r>
+        <w:rPr>
+          <w:rFonts w:ascii="Cambria" w:cs="Cambria" w:eastAsia="Cambria" w:hAnsi="Cambria"/>
+          <w:i w:val="false"/>
+          <w:iCs w:val="false"/>
+          <w:sz w:val="24"/>
+          <w:szCs w:val="24"/>
+        </w:rPr>
+        <w:t xml:space="preserve">Chapter </w:t>
+      </w:r>
+      <w:hyperlink w:history="1" w:anchor="toc34">
+        <w:r>
+          <w:rPr>
+            <w:rFonts w:ascii="Cambria" w:cs="Cambria" w:eastAsia="Cambria" w:hAnsi="Cambria"/>
+            <w:i w:val="false"/>
+            <w:iCs w:val="false"/>
+            <w:color w:val="44546A"/>
+            <w:sz w:val="24"/>
+            <w:szCs w:val="24"/>
+            <w:u w:val="single"/>
+          </w:rPr>
+          <w:t xml:space="preserve">26</w:t>
+        </w:r>
+      </w:hyperlink>
+      <w:r>
+        <w:rPr>
+          <w:rFonts w:ascii="Cambria" w:cs="Cambria" w:eastAsia="Cambria" w:hAnsi="Cambria"/>
+          <w:i w:val="false"/>
+          <w:iCs w:val="false"/>
+          <w:sz w:val="24"/>
+          <w:szCs w:val="24"/>
+        </w:rPr>
         <w:t xml:space="preserve">.</w:t>
       </w:r>
     </w:p>
@@ -33556,7 +33592,7 @@
             <w:szCs w:val="24"/>
             <w:u w:val="single"/>
           </w:rPr>
-          <w:t xml:space="preserve">31</w:t>
+          <w:t xml:space="preserve">30</w:t>
         </w:r>
       </w:hyperlink>
       <w:r>
@@ -33567,7 +33603,7 @@
           <w:sz w:val="24"/>
           <w:szCs w:val="24"/>
         </w:rPr>
-        <w:t xml:space="preserve"> and 41.</w:t>
+        <w:t xml:space="preserve"> and 40.</w:t>
       </w:r>
     </w:p>
     <w:p>
@@ -33811,7 +33847,7 @@
           <w:sz w:val="24"/>
           <w:szCs w:val="24"/>
         </w:rPr>
-        <w:t xml:space="preserve"> and 19.</w:t>
+        <w:t xml:space="preserve"> and 18.</w:t>
       </w:r>
     </w:p>
     <w:p>
@@ -34044,7 +34080,7 @@
             <w:szCs w:val="24"/>
             <w:u w:val="single"/>
           </w:rPr>
-          <w:t xml:space="preserve">18</w:t>
+          <w:t xml:space="preserve">17</w:t>
         </w:r>
       </w:hyperlink>
       <w:r>
@@ -34055,7 +34091,7 @@
           <w:sz w:val="24"/>
           <w:szCs w:val="24"/>
         </w:rPr>
-        <w:t xml:space="preserve"> and 19.</w:t>
+        <w:t xml:space="preserve"> and 18.</w:t>
       </w:r>
     </w:p>
     <w:p>
@@ -34115,7 +34151,7 @@
           <w:sz w:val="24"/>
           <w:szCs w:val="24"/>
         </w:rPr>
-        <w:t xml:space="preserve"> and 29.</w:t>
+        <w:t xml:space="preserve"> and 28.</w:t>
       </w:r>
     </w:p>
     <w:p>
@@ -34154,90 +34190,6 @@
         <w:t xml:space="preserve">Chapter </w:t>
       </w:r>
       <w:hyperlink w:history="1" w:anchor="toc51">
-        <w:r>
-          <w:rPr>
-            <w:rFonts w:ascii="Cambria" w:cs="Cambria" w:eastAsia="Cambria" w:hAnsi="Cambria"/>
-            <w:i w:val="false"/>
-            <w:iCs w:val="false"/>
-            <w:color w:val="44546A"/>
-            <w:sz w:val="24"/>
-            <w:szCs w:val="24"/>
-            <w:u w:val="single"/>
-          </w:rPr>
-          <w:t xml:space="preserve">40</w:t>
-        </w:r>
-      </w:hyperlink>
-      <w:r>
-        <w:rPr>
-          <w:rFonts w:ascii="Cambria" w:cs="Cambria" w:eastAsia="Cambria" w:hAnsi="Cambria"/>
-          <w:i w:val="false"/>
-          <w:iCs w:val="false"/>
-          <w:sz w:val="24"/>
-          <w:szCs w:val="24"/>
-        </w:rPr>
-        <w:t xml:space="preserve">.</w:t>
-      </w:r>
-    </w:p>
-    <w:p>
-      <w:pPr>
-        <w:spacing w:after="260" w:line="360" w:lineRule="auto"/>
-        <w:jc w:val="left"/>
-      </w:pPr>
-      <w:r>
-        <w:rPr>
-          <w:rFonts w:ascii="Cambria" w:cs="Cambria" w:eastAsia="Cambria" w:hAnsi="Cambria"/>
-          <w:b/>
-          <w:bCs/>
-          <w:sz w:val="24"/>
-          <w:szCs w:val="24"/>
-        </w:rPr>
-        <w:t xml:space="preserve">Renormalization.</w:t>
-      </w:r>
-      <w:r>
-        <w:rPr>
-          <w:rFonts w:ascii="Cambria" w:cs="Cambria" w:eastAsia="Cambria" w:hAnsi="Cambria"/>
-          <w:i w:val="false"/>
-          <w:iCs w:val="false"/>
-          <w:sz w:val="24"/>
-          <w:szCs w:val="24"/>
-        </w:rPr>
-        <w:t xml:space="preserve"> The bookkeeping that keeps measurable predictions unchanged when the resolution scale changes. </w:t>
-      </w:r>
-      <w:r>
-        <w:rPr>
-          <w:rFonts w:ascii="Cambria" w:cs="Cambria" w:eastAsia="Cambria" w:hAnsi="Cambria"/>
-          <w:i w:val="false"/>
-          <w:iCs w:val="false"/>
-          <w:sz w:val="24"/>
-          <w:szCs w:val="24"/>
-        </w:rPr>
-        <w:t xml:space="preserve">Chapters </w:t>
-      </w:r>
-      <w:hyperlink w:history="1" w:anchor="toc47">
-        <w:r>
-          <w:rPr>
-            <w:rFonts w:ascii="Cambria" w:cs="Cambria" w:eastAsia="Cambria" w:hAnsi="Cambria"/>
-            <w:i w:val="false"/>
-            <w:iCs w:val="false"/>
-            <w:color w:val="44546A"/>
-            <w:sz w:val="24"/>
-            <w:szCs w:val="24"/>
-            <w:u w:val="single"/>
-          </w:rPr>
-          <w:t xml:space="preserve">37</w:t>
-        </w:r>
-      </w:hyperlink>
-      <w:r>
-        <w:rPr>
-          <w:rFonts w:ascii="Cambria" w:cs="Cambria" w:eastAsia="Cambria" w:hAnsi="Cambria"/>
-          <w:i w:val="false"/>
-          <w:iCs w:val="false"/>
-          <w:sz w:val="24"/>
-          <w:szCs w:val="24"/>
-        </w:rPr>
-        <w:t xml:space="preserve">–</w:t>
-      </w:r>
-      <w:hyperlink w:history="1" w:anchor="toc49">
         <w:r>
           <w:rPr>
             <w:rFonts w:ascii="Cambria" w:cs="Cambria" w:eastAsia="Cambria" w:hAnsi="Cambria"/>
@@ -34275,17 +34227,17 @@
           <w:sz w:val="24"/>
           <w:szCs w:val="24"/>
         </w:rPr>
-        <w:t xml:space="preserve">Running coupling.</w:t>
-      </w:r>
-      <w:r>
-        <w:rPr>
-          <w:rFonts w:ascii="Cambria" w:cs="Cambria" w:eastAsia="Cambria" w:hAnsi="Cambria"/>
-          <w:i w:val="false"/>
-          <w:iCs w:val="false"/>
-          <w:sz w:val="24"/>
-          <w:szCs w:val="24"/>
-        </w:rPr>
-        <w:t xml:space="preserve"> The effective strength of the electromagnetic interaction as the energy of the probe changes. </w:t>
+        <w:t xml:space="preserve">Renormalization.</w:t>
+      </w:r>
+      <w:r>
+        <w:rPr>
+          <w:rFonts w:ascii="Cambria" w:cs="Cambria" w:eastAsia="Cambria" w:hAnsi="Cambria"/>
+          <w:i w:val="false"/>
+          <w:iCs w:val="false"/>
+          <w:sz w:val="24"/>
+          <w:szCs w:val="24"/>
+        </w:rPr>
+        <w:t xml:space="preserve"> The bookkeeping that keeps measurable predictions unchanged when the resolution scale changes. </w:t>
       </w:r>
       <w:r>
         <w:rPr>
@@ -34308,7 +34260,7 @@
             <w:szCs w:val="24"/>
             <w:u w:val="single"/>
           </w:rPr>
-          <w:t xml:space="preserve">37</w:t>
+          <w:t xml:space="preserve">36</w:t>
         </w:r>
       </w:hyperlink>
       <w:r>
@@ -34319,7 +34271,91 @@
           <w:sz w:val="24"/>
           <w:szCs w:val="24"/>
         </w:rPr>
-        <w:t xml:space="preserve"> and 38.</w:t>
+        <w:t xml:space="preserve">–</w:t>
+      </w:r>
+      <w:hyperlink w:history="1" w:anchor="toc49">
+        <w:r>
+          <w:rPr>
+            <w:rFonts w:ascii="Cambria" w:cs="Cambria" w:eastAsia="Cambria" w:hAnsi="Cambria"/>
+            <w:i w:val="false"/>
+            <w:iCs w:val="false"/>
+            <w:color w:val="44546A"/>
+            <w:sz w:val="24"/>
+            <w:szCs w:val="24"/>
+            <w:u w:val="single"/>
+          </w:rPr>
+          <w:t xml:space="preserve">38</w:t>
+        </w:r>
+      </w:hyperlink>
+      <w:r>
+        <w:rPr>
+          <w:rFonts w:ascii="Cambria" w:cs="Cambria" w:eastAsia="Cambria" w:hAnsi="Cambria"/>
+          <w:i w:val="false"/>
+          <w:iCs w:val="false"/>
+          <w:sz w:val="24"/>
+          <w:szCs w:val="24"/>
+        </w:rPr>
+        <w:t xml:space="preserve">.</w:t>
+      </w:r>
+    </w:p>
+    <w:p>
+      <w:pPr>
+        <w:spacing w:after="260" w:line="360" w:lineRule="auto"/>
+        <w:jc w:val="left"/>
+      </w:pPr>
+      <w:r>
+        <w:rPr>
+          <w:rFonts w:ascii="Cambria" w:cs="Cambria" w:eastAsia="Cambria" w:hAnsi="Cambria"/>
+          <w:b/>
+          <w:bCs/>
+          <w:sz w:val="24"/>
+          <w:szCs w:val="24"/>
+        </w:rPr>
+        <w:t xml:space="preserve">Running coupling.</w:t>
+      </w:r>
+      <w:r>
+        <w:rPr>
+          <w:rFonts w:ascii="Cambria" w:cs="Cambria" w:eastAsia="Cambria" w:hAnsi="Cambria"/>
+          <w:i w:val="false"/>
+          <w:iCs w:val="false"/>
+          <w:sz w:val="24"/>
+          <w:szCs w:val="24"/>
+        </w:rPr>
+        <w:t xml:space="preserve"> The effective strength of the electromagnetic interaction as the energy of the probe changes. </w:t>
+      </w:r>
+      <w:r>
+        <w:rPr>
+          <w:rFonts w:ascii="Cambria" w:cs="Cambria" w:eastAsia="Cambria" w:hAnsi="Cambria"/>
+          <w:i w:val="false"/>
+          <w:iCs w:val="false"/>
+          <w:sz w:val="24"/>
+          <w:szCs w:val="24"/>
+        </w:rPr>
+        <w:t xml:space="preserve">Chapters </w:t>
+      </w:r>
+      <w:hyperlink w:history="1" w:anchor="toc47">
+        <w:r>
+          <w:rPr>
+            <w:rFonts w:ascii="Cambria" w:cs="Cambria" w:eastAsia="Cambria" w:hAnsi="Cambria"/>
+            <w:i w:val="false"/>
+            <w:iCs w:val="false"/>
+            <w:color w:val="44546A"/>
+            <w:sz w:val="24"/>
+            <w:szCs w:val="24"/>
+            <w:u w:val="single"/>
+          </w:rPr>
+          <w:t xml:space="preserve">36</w:t>
+        </w:r>
+      </w:hyperlink>
+      <w:r>
+        <w:rPr>
+          <w:rFonts w:ascii="Cambria" w:cs="Cambria" w:eastAsia="Cambria" w:hAnsi="Cambria"/>
+          <w:i w:val="false"/>
+          <w:iCs w:val="false"/>
+          <w:sz w:val="24"/>
+          <w:szCs w:val="24"/>
+        </w:rPr>
+        <w:t xml:space="preserve"> and 37.</w:t>
       </w:r>
     </w:p>
     <w:p>
@@ -34459,7 +34495,7 @@
           <w:sz w:val="24"/>
           <w:szCs w:val="24"/>
         </w:rPr>
-        <w:t xml:space="preserve">, 21, and 31.</w:t>
+        <w:t xml:space="preserve">, 20, and 30.</w:t>
       </w:r>
     </w:p>
     <w:p>
@@ -34528,7 +34564,7 @@
             <w:szCs w:val="24"/>
             <w:u w:val="single"/>
           </w:rPr>
-          <w:t xml:space="preserve">31</w:t>
+          <w:t xml:space="preserve">30</w:t>
         </w:r>
       </w:hyperlink>
       <w:r>
@@ -34539,7 +34575,7 @@
           <w:sz w:val="24"/>
           <w:szCs w:val="24"/>
         </w:rPr>
-        <w:t xml:space="preserve"> and 32.</w:t>
+        <w:t xml:space="preserve"> and 31.</w:t>
       </w:r>
     </w:p>
     <w:p>
@@ -34588,7 +34624,7 @@
             <w:szCs w:val="24"/>
             <w:u w:val="single"/>
           </w:rPr>
-          <w:t xml:space="preserve">36</w:t>
+          <w:t xml:space="preserve">35</w:t>
         </w:r>
       </w:hyperlink>
       <w:r>
@@ -34659,7 +34695,7 @@
           <w:sz w:val="24"/>
           <w:szCs w:val="24"/>
         </w:rPr>
-        <w:t xml:space="preserve"> and 29.</w:t>
+        <w:t xml:space="preserve"> and 28.</w:t>
       </w:r>
     </w:p>
     <w:p>
@@ -34708,7 +34744,7 @@
             <w:szCs w:val="24"/>
             <w:u w:val="single"/>
           </w:rPr>
-          <w:t xml:space="preserve">35</w:t>
+          <w:t xml:space="preserve">34</w:t>
         </w:r>
       </w:hyperlink>
       <w:r>
@@ -34772,135 +34808,135 @@
           <w:sz w:val="24"/>
           <w:szCs w:val="24"/>
         </w:rPr>
-        <w:t xml:space="preserve">Abrikosov, 27</w:t>
-      </w:r>
-    </w:p>
-    <w:p>
-      <w:pPr>
-        <w:spacing w:after="260" w:line="360" w:lineRule="auto"/>
-        <w:jc w:val="left"/>
-      </w:pPr>
-      <w:r>
-        <w:rPr>
-          <w:rFonts w:ascii="Cambria" w:cs="Cambria" w:eastAsia="Cambria" w:hAnsi="Cambria"/>
-          <w:i w:val="false"/>
-          <w:iCs w:val="false"/>
-          <w:sz w:val="24"/>
-          <w:szCs w:val="24"/>
-        </w:rPr>
-        <w:t xml:space="preserve">Aspect, Grangier, and Roger, 33</w:t>
-      </w:r>
-    </w:p>
-    <w:p>
-      <w:pPr>
-        <w:spacing w:after="260" w:line="360" w:lineRule="auto"/>
-        <w:jc w:val="left"/>
-      </w:pPr>
-      <w:r>
-        <w:rPr>
-          <w:rFonts w:ascii="Cambria" w:cs="Cambria" w:eastAsia="Cambria" w:hAnsi="Cambria"/>
-          <w:i w:val="false"/>
-          <w:iCs w:val="false"/>
-          <w:sz w:val="24"/>
-          <w:szCs w:val="24"/>
-        </w:rPr>
-        <w:t xml:space="preserve">Einstein, magnet and conductor, 26</w:t>
-      </w:r>
-    </w:p>
-    <w:p>
-      <w:pPr>
-        <w:spacing w:after="260" w:line="360" w:lineRule="auto"/>
-        <w:jc w:val="left"/>
-      </w:pPr>
-      <w:r>
-        <w:rPr>
-          <w:rFonts w:ascii="Cambria" w:cs="Cambria" w:eastAsia="Cambria" w:hAnsi="Cambria"/>
-          <w:i w:val="false"/>
-          <w:iCs w:val="false"/>
-          <w:sz w:val="24"/>
-          <w:szCs w:val="24"/>
-        </w:rPr>
-        <w:t xml:space="preserve">Feynman, 10, 16, 29</w:t>
-      </w:r>
-    </w:p>
-    <w:p>
-      <w:pPr>
-        <w:spacing w:after="260" w:line="360" w:lineRule="auto"/>
-        <w:jc w:val="left"/>
-      </w:pPr>
-      <w:r>
-        <w:rPr>
-          <w:rFonts w:ascii="Cambria" w:cs="Cambria" w:eastAsia="Cambria" w:hAnsi="Cambria"/>
-          <w:i w:val="false"/>
-          <w:iCs w:val="false"/>
-          <w:sz w:val="24"/>
-          <w:szCs w:val="24"/>
-        </w:rPr>
-        <w:t xml:space="preserve">Lamb and Retherford, 20</w:t>
-      </w:r>
-    </w:p>
-    <w:p>
-      <w:pPr>
-        <w:spacing w:after="260" w:line="360" w:lineRule="auto"/>
-        <w:jc w:val="left"/>
-      </w:pPr>
-      <w:r>
-        <w:rPr>
-          <w:rFonts w:ascii="Cambria" w:cs="Cambria" w:eastAsia="Cambria" w:hAnsi="Cambria"/>
-          <w:i w:val="false"/>
-          <w:iCs w:val="false"/>
-          <w:sz w:val="24"/>
-          <w:szCs w:val="24"/>
-        </w:rPr>
-        <w:t xml:space="preserve">Lamoreaux, 26</w:t>
-      </w:r>
-    </w:p>
-    <w:p>
-      <w:pPr>
-        <w:spacing w:after="260" w:line="360" w:lineRule="auto"/>
-        <w:jc w:val="left"/>
-      </w:pPr>
-      <w:r>
-        <w:rPr>
-          <w:rFonts w:ascii="Cambria" w:cs="Cambria" w:eastAsia="Cambria" w:hAnsi="Cambria"/>
-          <w:i w:val="false"/>
-          <w:iCs w:val="false"/>
-          <w:sz w:val="24"/>
-          <w:szCs w:val="24"/>
-        </w:rPr>
-        <w:t xml:space="preserve">Mead, front matter, 42, 47</w:t>
-      </w:r>
-    </w:p>
-    <w:p>
-      <w:pPr>
-        <w:spacing w:after="260" w:line="360" w:lineRule="auto"/>
-        <w:jc w:val="left"/>
-      </w:pPr>
-      <w:r>
-        <w:rPr>
-          <w:rFonts w:ascii="Cambria" w:cs="Cambria" w:eastAsia="Cambria" w:hAnsi="Cambria"/>
-          <w:i w:val="false"/>
-          <w:iCs w:val="false"/>
-          <w:sz w:val="24"/>
-          <w:szCs w:val="24"/>
-        </w:rPr>
-        <w:t xml:space="preserve">Noether, 24</w:t>
-      </w:r>
-    </w:p>
-    <w:p>
-      <w:pPr>
-        <w:spacing w:after="260" w:line="360" w:lineRule="auto"/>
-        <w:jc w:val="left"/>
-      </w:pPr>
-      <w:r>
-        <w:rPr>
-          <w:rFonts w:ascii="Cambria" w:cs="Cambria" w:eastAsia="Cambria" w:hAnsi="Cambria"/>
-          <w:i w:val="false"/>
-          <w:iCs w:val="false"/>
-          <w:sz w:val="24"/>
-          <w:szCs w:val="24"/>
-        </w:rPr>
-        <w:t xml:space="preserve">Schwinger, 37</w:t>
+        <w:t xml:space="preserve">Abrikosov, 26</w:t>
+      </w:r>
+    </w:p>
+    <w:p>
+      <w:pPr>
+        <w:spacing w:after="260" w:line="360" w:lineRule="auto"/>
+        <w:jc w:val="left"/>
+      </w:pPr>
+      <w:r>
+        <w:rPr>
+          <w:rFonts w:ascii="Cambria" w:cs="Cambria" w:eastAsia="Cambria" w:hAnsi="Cambria"/>
+          <w:i w:val="false"/>
+          <w:iCs w:val="false"/>
+          <w:sz w:val="24"/>
+          <w:szCs w:val="24"/>
+        </w:rPr>
+        <w:t xml:space="preserve">Aspect, Grangier, and Roger, 32</w:t>
+      </w:r>
+    </w:p>
+    <w:p>
+      <w:pPr>
+        <w:spacing w:after="260" w:line="360" w:lineRule="auto"/>
+        <w:jc w:val="left"/>
+      </w:pPr>
+      <w:r>
+        <w:rPr>
+          <w:rFonts w:ascii="Cambria" w:cs="Cambria" w:eastAsia="Cambria" w:hAnsi="Cambria"/>
+          <w:i w:val="false"/>
+          <w:iCs w:val="false"/>
+          <w:sz w:val="24"/>
+          <w:szCs w:val="24"/>
+        </w:rPr>
+        <w:t xml:space="preserve">Einstein, magnet and conductor, 25</w:t>
+      </w:r>
+    </w:p>
+    <w:p>
+      <w:pPr>
+        <w:spacing w:after="260" w:line="360" w:lineRule="auto"/>
+        <w:jc w:val="left"/>
+      </w:pPr>
+      <w:r>
+        <w:rPr>
+          <w:rFonts w:ascii="Cambria" w:cs="Cambria" w:eastAsia="Cambria" w:hAnsi="Cambria"/>
+          <w:i w:val="false"/>
+          <w:iCs w:val="false"/>
+          <w:sz w:val="24"/>
+          <w:szCs w:val="24"/>
+        </w:rPr>
+        <w:t xml:space="preserve">Feynman, 10, 16, 28</w:t>
+      </w:r>
+    </w:p>
+    <w:p>
+      <w:pPr>
+        <w:spacing w:after="260" w:line="360" w:lineRule="auto"/>
+        <w:jc w:val="left"/>
+      </w:pPr>
+      <w:r>
+        <w:rPr>
+          <w:rFonts w:ascii="Cambria" w:cs="Cambria" w:eastAsia="Cambria" w:hAnsi="Cambria"/>
+          <w:i w:val="false"/>
+          <w:iCs w:val="false"/>
+          <w:sz w:val="24"/>
+          <w:szCs w:val="24"/>
+        </w:rPr>
+        <w:t xml:space="preserve">Lamb and Retherford, 19</w:t>
+      </w:r>
+    </w:p>
+    <w:p>
+      <w:pPr>
+        <w:spacing w:after="260" w:line="360" w:lineRule="auto"/>
+        <w:jc w:val="left"/>
+      </w:pPr>
+      <w:r>
+        <w:rPr>
+          <w:rFonts w:ascii="Cambria" w:cs="Cambria" w:eastAsia="Cambria" w:hAnsi="Cambria"/>
+          <w:i w:val="false"/>
+          <w:iCs w:val="false"/>
+          <w:sz w:val="24"/>
+          <w:szCs w:val="24"/>
+        </w:rPr>
+        <w:t xml:space="preserve">Lamoreaux, 25</w:t>
+      </w:r>
+    </w:p>
+    <w:p>
+      <w:pPr>
+        <w:spacing w:after="260" w:line="360" w:lineRule="auto"/>
+        <w:jc w:val="left"/>
+      </w:pPr>
+      <w:r>
+        <w:rPr>
+          <w:rFonts w:ascii="Cambria" w:cs="Cambria" w:eastAsia="Cambria" w:hAnsi="Cambria"/>
+          <w:i w:val="false"/>
+          <w:iCs w:val="false"/>
+          <w:sz w:val="24"/>
+          <w:szCs w:val="24"/>
+        </w:rPr>
+        <w:t xml:space="preserve">Mead, front matter, 41, 46</w:t>
+      </w:r>
+    </w:p>
+    <w:p>
+      <w:pPr>
+        <w:spacing w:after="260" w:line="360" w:lineRule="auto"/>
+        <w:jc w:val="left"/>
+      </w:pPr>
+      <w:r>
+        <w:rPr>
+          <w:rFonts w:ascii="Cambria" w:cs="Cambria" w:eastAsia="Cambria" w:hAnsi="Cambria"/>
+          <w:i w:val="false"/>
+          <w:iCs w:val="false"/>
+          <w:sz w:val="24"/>
+          <w:szCs w:val="24"/>
+        </w:rPr>
+        <w:t xml:space="preserve">Noether, 23</w:t>
+      </w:r>
+    </w:p>
+    <w:p>
+      <w:pPr>
+        <w:spacing w:after="260" w:line="360" w:lineRule="auto"/>
+        <w:jc w:val="left"/>
+      </w:pPr>
+      <w:r>
+        <w:rPr>
+          <w:rFonts w:ascii="Cambria" w:cs="Cambria" w:eastAsia="Cambria" w:hAnsi="Cambria"/>
+          <w:i w:val="false"/>
+          <w:iCs w:val="false"/>
+          <w:sz w:val="24"/>
+          <w:szCs w:val="24"/>
+        </w:rPr>
+        <w:t xml:space="preserve">Schwinger, 36</w:t>
       </w:r>
     </w:p>
     <w:p>
@@ -34932,23 +34968,23 @@
           <w:sz w:val="24"/>
           <w:szCs w:val="24"/>
         </w:rPr>
-        <w:t xml:space="preserve">Weber and Kohlrausch, 26</w:t>
-      </w:r>
-    </w:p>
-    <w:p>
-      <w:pPr>
-        <w:spacing w:after="260" w:line="360" w:lineRule="auto"/>
-        <w:jc w:val="left"/>
-      </w:pPr>
-      <w:r>
-        <w:rPr>
-          <w:rFonts w:ascii="Cambria" w:cs="Cambria" w:eastAsia="Cambria" w:hAnsi="Cambria"/>
-          <w:i w:val="false"/>
-          <w:iCs w:val="false"/>
-          <w:sz w:val="24"/>
-          <w:szCs w:val="24"/>
-        </w:rPr>
-        <w:t xml:space="preserve">Wheeler and Feynman, 15, 16, 18, 19, 47</w:t>
+        <w:t xml:space="preserve">Weber and Kohlrausch, 25</w:t>
+      </w:r>
+    </w:p>
+    <w:p>
+      <w:pPr>
+        <w:spacing w:after="260" w:line="360" w:lineRule="auto"/>
+        <w:jc w:val="left"/>
+      </w:pPr>
+      <w:r>
+        <w:rPr>
+          <w:rFonts w:ascii="Cambria" w:cs="Cambria" w:eastAsia="Cambria" w:hAnsi="Cambria"/>
+          <w:i w:val="false"/>
+          <w:iCs w:val="false"/>
+          <w:sz w:val="24"/>
+          <w:szCs w:val="24"/>
+        </w:rPr>
+        <w:t xml:space="preserve">Wheeler and Feynman, 15, 16, 17, 18, 46</w:t>
       </w:r>
     </w:p>
     <w:p>
@@ -36653,7 +36689,7 @@
           <w:sz w:val="24"/>
           <w:szCs w:val="24"/>
         </w:rPr>
-        <w:t xml:space="preserve">The Lamb shift in hydrogen is about 1058 megahertz. A photon scattered straight back off an electron lengthens by about five picometers. Ideal Casimir plates a micrometer apart feel about a millipascal. Abrikosov vortices in a field of a tenth of a tesla sit roughly 150 nanometers apart. Weber and Kohlrausch’s 1856 ratio matched the speed of light to about one percent.</w:t>
+        <w:t xml:space="preserve">The Lamb shift in hydrogen is about 1058 megahertz. A photon scattered straight back off an electron lengthens by about five picometers. Ideal Casimir plates a micrometer apart feel about a millipascal. Abrikosov vortices in a field of a tenth of a tesla sit roughly 150 nanometers apart. Weber and Kohlrausch’s 1856 ratio matched the speed of light, as measured at the time, to within about one percent.</w:t>
       </w:r>
     </w:p>
     <w:p>
@@ -36942,7 +36978,7 @@
             <w:szCs w:val="24"/>
             <w:u w:val="single"/>
           </w:rPr>
-          <w:t xml:space="preserve">28</w:t>
+          <w:t xml:space="preserve">27</w:t>
         </w:r>
       </w:hyperlink>
       <w:r>
@@ -37112,7 +37148,7 @@
           <w:sz w:val="24"/>
           <w:szCs w:val="24"/>
         </w:rPr>
-        <w:t xml:space="preserve"> next. It is the map this book grew out of: entanglement, Bell tests, quantum fields, quantum gravity, interpretations, computing, and cryptography. This book began there, as an interlude on collective electrodynamics that outgrew its chapter.</w:t>
+        <w:t xml:space="preserve"> next. It is the map this book grew out of: entanglement, Bell tests, interpretations, quantum fields, the strong force, QED, cryptography, and computing. This book began there, as an appendix on collective electrodynamics that outgrew its pages.</w:t>
       </w:r>
     </w:p>
     <w:p>
@@ -37195,17 +37231,161 @@
     <w:p>
       <w:pPr>
         <w:spacing w:after="260" w:line="360" w:lineRule="auto"/>
-        <w:jc w:val="center"/>
-      </w:pPr>
-      <w:r>
-        <w:rPr>
-          <w:rFonts w:ascii="Cambria Math" w:cs="Cambria Math" w:eastAsia="Cambria Math" w:hAnsi="Cambria Math"/>
-          <w:i/>
-          <w:iCs/>
-          <w:sz w:val="24"/>
-          <w:szCs w:val="24"/>
-        </w:rPr>
-        <w:t xml:space="preserve">The Quantum World</w:t>
+        <w:jc w:val="left"/>
+      </w:pPr>
+      <w:r>
+        <w:rPr>
+          <w:rFonts w:ascii="Cambria Math" w:cs="Cambria Math" w:eastAsia="Cambria Math" w:hAnsi="Cambria Math"/>
+          <w:i/>
+          <w:iCs/>
+          <w:sz w:val="24"/>
+          <w:szCs w:val="24"/>
+        </w:rPr>
+        <w:t xml:space="preserve">The Quantum World: From Quanta and Entanglement to Quantum Fields, Gravity, and the Future of Computing</w:t>
+      </w:r>
+      <w:r>
+        <w:rPr>
+          <w:rFonts w:ascii="Cambria" w:cs="Cambria" w:eastAsia="Cambria" w:hAnsi="Cambria"/>
+          <w:i w:val="false"/>
+          <w:iCs w:val="false"/>
+          <w:sz w:val="24"/>
+          <w:szCs w:val="24"/>
+        </w:rPr>
+        <w:t xml:space="preserve">. The companion book to the </w:t>
+      </w:r>
+      <w:r>
+        <w:rPr>
+          <w:rFonts w:ascii="Cambria Math" w:cs="Cambria Math" w:eastAsia="Cambria Math" w:hAnsi="Cambria Math"/>
+          <w:i/>
+          <w:iCs/>
+          <w:sz w:val="24"/>
+          <w:szCs w:val="24"/>
+        </w:rPr>
+        <w:t xml:space="preserve">Physics, Actually</w:t>
+      </w:r>
+      <w:r>
+        <w:rPr>
+          <w:rFonts w:ascii="Cambria" w:cs="Cambria" w:eastAsia="Cambria" w:hAnsi="Cambria"/>
+          <w:i w:val="false"/>
+          <w:iCs w:val="false"/>
+          <w:sz w:val="24"/>
+          <w:szCs w:val="24"/>
+        </w:rPr>
+        <w:t xml:space="preserve"> series, and the survey this book grew out of.</w:t>
+      </w:r>
+    </w:p>
+    <w:p>
+      <w:pPr>
+        <w:spacing w:after="260" w:line="360" w:lineRule="auto"/>
+        <w:jc w:val="left"/>
+      </w:pPr>
+      <w:r>
+        <w:rPr>
+          <w:rFonts w:ascii="Cambria" w:cs="Cambria" w:eastAsia="Cambria" w:hAnsi="Cambria"/>
+          <w:i w:val="false"/>
+          <w:iCs w:val="false"/>
+          <w:sz w:val="24"/>
+          <w:szCs w:val="24"/>
+        </w:rPr>
+        <w:t xml:space="preserve">The </w:t>
+      </w:r>
+      <w:r>
+        <w:rPr>
+          <w:rFonts w:ascii="Cambria Math" w:cs="Cambria Math" w:eastAsia="Cambria Math" w:hAnsi="Cambria Math"/>
+          <w:i/>
+          <w:iCs/>
+          <w:sz w:val="24"/>
+          <w:szCs w:val="24"/>
+        </w:rPr>
+        <w:t xml:space="preserve">Physics, Actually</w:t>
+      </w:r>
+      <w:r>
+        <w:rPr>
+          <w:rFonts w:ascii="Cambria" w:cs="Cambria" w:eastAsia="Cambria" w:hAnsi="Cambria"/>
+          <w:i w:val="false"/>
+          <w:iCs w:val="false"/>
+          <w:sz w:val="24"/>
+          <w:szCs w:val="24"/>
+        </w:rPr>
+        <w:t xml:space="preserve"> series:</w:t>
+      </w:r>
+    </w:p>
+    <w:p>
+      <w:pPr>
+        <w:spacing w:after="260" w:line="360" w:lineRule="auto"/>
+        <w:jc w:val="left"/>
+      </w:pPr>
+      <w:r>
+        <w:rPr>
+          <w:rFonts w:ascii="Cambria" w:cs="Cambria" w:eastAsia="Cambria" w:hAnsi="Cambria"/>
+          <w:i w:val="false"/>
+          <w:iCs w:val="false"/>
+          <w:sz w:val="24"/>
+          <w:szCs w:val="24"/>
+        </w:rPr>
+        <w:t xml:space="preserve">Volume 1: </w:t>
+      </w:r>
+      <w:r>
+        <w:rPr>
+          <w:rFonts w:ascii="Cambria Math" w:cs="Cambria Math" w:eastAsia="Cambria Math" w:hAnsi="Cambria Math"/>
+          <w:i/>
+          <w:iCs/>
+          <w:sz w:val="24"/>
+          <w:szCs w:val="24"/>
+        </w:rPr>
+        <w:t xml:space="preserve">Motion, Forces, Time, and Relativity</w:t>
+      </w:r>
+    </w:p>
+    <w:p>
+      <w:pPr>
+        <w:spacing w:after="260" w:line="360" w:lineRule="auto"/>
+        <w:jc w:val="left"/>
+      </w:pPr>
+      <w:r>
+        <w:rPr>
+          <w:rFonts w:ascii="Cambria" w:cs="Cambria" w:eastAsia="Cambria" w:hAnsi="Cambria"/>
+          <w:i w:val="false"/>
+          <w:iCs w:val="false"/>
+          <w:sz w:val="24"/>
+          <w:szCs w:val="24"/>
+        </w:rPr>
+        <w:t xml:space="preserve">Volume 2: </w:t>
+      </w:r>
+      <w:r>
+        <w:rPr>
+          <w:rFonts w:ascii="Cambria Math" w:cs="Cambria Math" w:eastAsia="Cambria Math" w:hAnsi="Cambria Math"/>
+          <w:i/>
+          <w:iCs/>
+          <w:sz w:val="24"/>
+          <w:szCs w:val="24"/>
+        </w:rPr>
+        <w:t xml:space="preserve">Gravity, Cosmology, and the Limits of Spacetime</w:t>
+      </w:r>
+    </w:p>
+    <w:p>
+      <w:pPr>
+        <w:spacing w:after="260" w:line="360" w:lineRule="auto"/>
+        <w:jc w:val="left"/>
+      </w:pPr>
+      <w:r>
+        <w:rPr>
+          <w:rFonts w:ascii="Cambria" w:cs="Cambria" w:eastAsia="Cambria" w:hAnsi="Cambria"/>
+          <w:i w:val="false"/>
+          <w:iCs w:val="false"/>
+          <w:sz w:val="24"/>
+          <w:szCs w:val="24"/>
+        </w:rPr>
+        <w:t xml:space="preserve">Volume 3: </w:t>
+      </w:r>
+      <w:r>
+        <w:rPr>
+          <w:rFonts w:ascii="Cambria Math" w:cs="Cambria Math" w:eastAsia="Cambria Math" w:hAnsi="Cambria Math"/>
+          <w:i/>
+          <w:iCs/>
+          <w:sz w:val="24"/>
+          <w:szCs w:val="24"/>
+        </w:rPr>
+        <w:t xml:space="preserve">The Standard Model, Chaos, and the Edge of Knowledge</w:t>
       </w:r>
     </w:p>
     <w:p>

</xml_diff>